<commit_message>
Desarrollo inicial del back-end
</commit_message>
<xml_diff>
--- a/Documentacion/Vidal_Agustín_PRG2_MORENAMODAS_Semana5_Etapa5.docx
+++ b/Documentacion/Vidal_Agustín_PRG2_MORENAMODAS_Semana5_Etapa5.docx
@@ -389,6 +389,2347 @@
           <w:szCs w:val="24"/>
         </w:rPr>
       </w:pPr>
+      <w:r>
+        <w:rPr>
+          <w:rFonts w:asciiTheme="minorBidi" w:hAnsiTheme="minorBidi"/>
+          <w:sz w:val="24"/>
+          <w:szCs w:val="24"/>
+        </w:rPr>
+        <w:lastRenderedPageBreak/>
+        <w:t xml:space="preserve">1. </w:t>
+      </w:r>
+      <w:r>
+        <w:rPr>
+          <w:rFonts w:asciiTheme="minorBidi" w:hAnsiTheme="minorBidi"/>
+          <w:b/>
+          <w:bCs/>
+          <w:sz w:val="24"/>
+          <w:szCs w:val="24"/>
+        </w:rPr>
+        <w:t>Pantallas desarrolladas</w:t>
+      </w:r>
+    </w:p>
+    <w:p>
+      <w:pPr>
+        <w:jc w:val="both"/>
+        <w:rPr>
+          <w:rFonts w:asciiTheme="minorBidi" w:hAnsiTheme="minorBidi"/>
+          <w:sz w:val="24"/>
+          <w:szCs w:val="24"/>
+        </w:rPr>
+      </w:pPr>
+      <w:r>
+        <w:rPr>
+          <w:rFonts w:asciiTheme="minorBidi" w:hAnsiTheme="minorBidi"/>
+          <w:sz w:val="24"/>
+          <w:szCs w:val="24"/>
+        </w:rPr>
+        <w:t>Durante esta etapa se desarrollaron las principales pantallas correspondientes al recorrido del cliente dentro del sistema MORENA MODAS.</w:t>
+      </w:r>
+    </w:p>
+    <w:p>
+      <w:pPr>
+        <w:jc w:val="both"/>
+        <w:rPr>
+          <w:rFonts w:asciiTheme="minorBidi" w:hAnsiTheme="minorBidi"/>
+          <w:sz w:val="24"/>
+          <w:szCs w:val="24"/>
+        </w:rPr>
+      </w:pPr>
+      <w:r>
+        <w:rPr>
+          <w:rFonts w:asciiTheme="minorBidi" w:hAnsiTheme="minorBidi"/>
+          <w:sz w:val="24"/>
+          <w:szCs w:val="24"/>
+        </w:rPr>
+        <w:t>Se desarrolló la pantalla de Inicio, que funciona como punto de entrada al sistema y permite acceder a las diferentes secciones mediante el menú de navegación.</w:t>
+      </w:r>
+    </w:p>
+    <w:p>
+      <w:pPr>
+        <w:jc w:val="both"/>
+        <w:rPr>
+          <w:rFonts w:asciiTheme="minorBidi" w:hAnsiTheme="minorBidi"/>
+          <w:sz w:val="24"/>
+          <w:szCs w:val="24"/>
+        </w:rPr>
+      </w:pPr>
+      <w:r>
+        <w:rPr>
+          <w:rFonts w:asciiTheme="minorBidi" w:hAnsiTheme="minorBidi"/>
+          <w:sz w:val="24"/>
+          <w:szCs w:val="24"/>
+        </w:rPr>
+        <w:t xml:space="preserve">También se desarrolló la pantalla de Productos, donde se muestran las prendas disponibles para consulta. Para las pruebas se incorporaron tres productos: Remera básica, Campera urbana y Pantalón </w:t>
+      </w:r>
+      <w:proofErr w:type="spellStart"/>
+      <w:r>
+        <w:rPr>
+          <w:rFonts w:asciiTheme="minorBidi" w:hAnsiTheme="minorBidi"/>
+          <w:sz w:val="24"/>
+          <w:szCs w:val="24"/>
+        </w:rPr>
+        <w:t>wide</w:t>
+      </w:r>
+      <w:proofErr w:type="spellEnd"/>
+      <w:r>
+        <w:rPr>
+          <w:rFonts w:asciiTheme="minorBidi" w:hAnsiTheme="minorBidi"/>
+          <w:sz w:val="24"/>
+          <w:szCs w:val="24"/>
+        </w:rPr>
+        <w:t xml:space="preserve"> </w:t>
+      </w:r>
+      <w:proofErr w:type="spellStart"/>
+      <w:r>
+        <w:rPr>
+          <w:rFonts w:asciiTheme="minorBidi" w:hAnsiTheme="minorBidi"/>
+          <w:sz w:val="24"/>
+          <w:szCs w:val="24"/>
+        </w:rPr>
+        <w:t>leg</w:t>
+      </w:r>
+      <w:proofErr w:type="spellEnd"/>
+      <w:r>
+        <w:rPr>
+          <w:rFonts w:asciiTheme="minorBidi" w:hAnsiTheme="minorBidi"/>
+          <w:sz w:val="24"/>
+          <w:szCs w:val="24"/>
+        </w:rPr>
+        <w:t>.</w:t>
+      </w:r>
+    </w:p>
+    <w:p>
+      <w:pPr>
+        <w:jc w:val="both"/>
+        <w:rPr>
+          <w:rFonts w:asciiTheme="minorBidi" w:hAnsiTheme="minorBidi"/>
+          <w:sz w:val="24"/>
+          <w:szCs w:val="24"/>
+        </w:rPr>
+      </w:pPr>
+      <w:r>
+        <w:rPr>
+          <w:rFonts w:asciiTheme="minorBidi" w:hAnsiTheme="minorBidi"/>
+          <w:sz w:val="24"/>
+          <w:szCs w:val="24"/>
+        </w:rPr>
+        <w:t>Cada producto cuenta con una pantalla de Detalle del producto, donde se muestra información como nombre, precio, talle, color y disponibilidad. Desde esta pantalla el usuario puede iniciar el proceso de reserva.</w:t>
+      </w:r>
+    </w:p>
+    <w:p>
+      <w:pPr>
+        <w:jc w:val="both"/>
+        <w:rPr>
+          <w:rFonts w:asciiTheme="minorBidi" w:hAnsiTheme="minorBidi"/>
+          <w:sz w:val="24"/>
+          <w:szCs w:val="24"/>
+        </w:rPr>
+      </w:pPr>
+      <w:r>
+        <w:rPr>
+          <w:rFonts w:asciiTheme="minorBidi" w:hAnsiTheme="minorBidi"/>
+          <w:sz w:val="24"/>
+          <w:szCs w:val="24"/>
+        </w:rPr>
+        <w:t>También se desarrollaron las pantallas de Registro e Inicio de sesión, necesarias para que el cliente pueda acceder a las funciones relacionadas con las reservas.</w:t>
+      </w:r>
+    </w:p>
+    <w:p>
+      <w:pPr>
+        <w:jc w:val="both"/>
+        <w:rPr>
+          <w:rFonts w:asciiTheme="minorBidi" w:hAnsiTheme="minorBidi"/>
+          <w:sz w:val="24"/>
+          <w:szCs w:val="24"/>
+        </w:rPr>
+      </w:pPr>
+      <w:r>
+        <w:rPr>
+          <w:rFonts w:asciiTheme="minorBidi" w:hAnsiTheme="minorBidi"/>
+          <w:sz w:val="24"/>
+          <w:szCs w:val="24"/>
+        </w:rPr>
+        <w:t>Por último, se desarrollaron las pantallas de Reserva, Confirmación y Mis reservas, completando el recorrido principal del usuario.</w:t>
+      </w:r>
+    </w:p>
+    <w:p>
+      <w:pPr>
+        <w:jc w:val="both"/>
+        <w:rPr>
+          <w:rFonts w:asciiTheme="minorBidi" w:hAnsiTheme="minorBidi"/>
+          <w:sz w:val="24"/>
+          <w:szCs w:val="24"/>
+        </w:rPr>
+      </w:pPr>
+    </w:p>
+    <w:p>
+      <w:pPr>
+        <w:jc w:val="both"/>
+        <w:rPr>
+          <w:rFonts w:asciiTheme="minorBidi" w:hAnsiTheme="minorBidi"/>
+          <w:sz w:val="24"/>
+          <w:szCs w:val="24"/>
+        </w:rPr>
+      </w:pPr>
+    </w:p>
+    <w:p>
+      <w:pPr>
+        <w:jc w:val="both"/>
+        <w:rPr>
+          <w:rFonts w:asciiTheme="minorBidi" w:hAnsiTheme="minorBidi"/>
+          <w:sz w:val="24"/>
+          <w:szCs w:val="24"/>
+        </w:rPr>
+      </w:pPr>
+      <w:r>
+        <w:rPr>
+          <w:rFonts w:asciiTheme="minorBidi" w:hAnsiTheme="minorBidi"/>
+          <w:sz w:val="24"/>
+          <w:szCs w:val="24"/>
+        </w:rPr>
+        <w:t xml:space="preserve">2. </w:t>
+      </w:r>
+      <w:r>
+        <w:rPr>
+          <w:rFonts w:asciiTheme="minorBidi" w:hAnsiTheme="minorBidi"/>
+          <w:b/>
+          <w:bCs/>
+          <w:sz w:val="24"/>
+          <w:szCs w:val="24"/>
+        </w:rPr>
+        <w:t>Formularios principales</w:t>
+      </w:r>
+    </w:p>
+    <w:p>
+      <w:pPr>
+        <w:jc w:val="both"/>
+        <w:rPr>
+          <w:rFonts w:asciiTheme="minorBidi" w:hAnsiTheme="minorBidi"/>
+          <w:sz w:val="24"/>
+          <w:szCs w:val="24"/>
+        </w:rPr>
+      </w:pPr>
+      <w:r>
+        <w:rPr>
+          <w:rFonts w:asciiTheme="minorBidi" w:hAnsiTheme="minorBidi"/>
+          <w:sz w:val="24"/>
+          <w:szCs w:val="24"/>
+        </w:rPr>
+        <w:t>Se desarrollaron tres formularios principales dentro del sistema.</w:t>
+      </w:r>
+    </w:p>
+    <w:p>
+      <w:pPr>
+        <w:jc w:val="both"/>
+        <w:rPr>
+          <w:rFonts w:asciiTheme="minorBidi" w:hAnsiTheme="minorBidi"/>
+          <w:sz w:val="24"/>
+          <w:szCs w:val="24"/>
+        </w:rPr>
+      </w:pPr>
+      <w:r>
+        <w:rPr>
+          <w:rFonts w:asciiTheme="minorBidi" w:hAnsiTheme="minorBidi"/>
+          <w:sz w:val="24"/>
+          <w:szCs w:val="24"/>
+        </w:rPr>
+        <w:t>Formulario de registro</w:t>
+      </w:r>
+    </w:p>
+    <w:p>
+      <w:pPr>
+        <w:jc w:val="both"/>
+        <w:rPr>
+          <w:rFonts w:asciiTheme="minorBidi" w:hAnsiTheme="minorBidi"/>
+          <w:sz w:val="24"/>
+          <w:szCs w:val="24"/>
+        </w:rPr>
+      </w:pPr>
+      <w:r>
+        <w:rPr>
+          <w:rFonts w:asciiTheme="minorBidi" w:hAnsiTheme="minorBidi"/>
+          <w:sz w:val="24"/>
+          <w:szCs w:val="24"/>
+        </w:rPr>
+        <w:t>Permite crear una cuenta de usuario solicitando:</w:t>
+      </w:r>
+    </w:p>
+    <w:p>
+      <w:pPr>
+        <w:pStyle w:val="Prrafodelista"/>
+        <w:numPr>
+          <w:ilvl w:val="0"/>
+          <w:numId w:val="1"/>
+        </w:numPr>
+        <w:jc w:val="both"/>
+        <w:rPr>
+          <w:rFonts w:asciiTheme="minorBidi" w:hAnsiTheme="minorBidi"/>
+          <w:sz w:val="24"/>
+          <w:szCs w:val="24"/>
+        </w:rPr>
+      </w:pPr>
+      <w:r>
+        <w:rPr>
+          <w:rFonts w:asciiTheme="minorBidi" w:hAnsiTheme="minorBidi"/>
+          <w:sz w:val="24"/>
+          <w:szCs w:val="24"/>
+        </w:rPr>
+        <w:t>Nombre.</w:t>
+      </w:r>
+    </w:p>
+    <w:p>
+      <w:pPr>
+        <w:pStyle w:val="Prrafodelista"/>
+        <w:numPr>
+          <w:ilvl w:val="0"/>
+          <w:numId w:val="1"/>
+        </w:numPr>
+        <w:jc w:val="both"/>
+        <w:rPr>
+          <w:rFonts w:asciiTheme="minorBidi" w:hAnsiTheme="minorBidi"/>
+          <w:sz w:val="24"/>
+          <w:szCs w:val="24"/>
+        </w:rPr>
+      </w:pPr>
+      <w:r>
+        <w:rPr>
+          <w:rFonts w:asciiTheme="minorBidi" w:hAnsiTheme="minorBidi"/>
+          <w:sz w:val="24"/>
+          <w:szCs w:val="24"/>
+        </w:rPr>
+        <w:t>Apellido.</w:t>
+      </w:r>
+    </w:p>
+    <w:p>
+      <w:pPr>
+        <w:pStyle w:val="Prrafodelista"/>
+        <w:numPr>
+          <w:ilvl w:val="0"/>
+          <w:numId w:val="1"/>
+        </w:numPr>
+        <w:jc w:val="both"/>
+        <w:rPr>
+          <w:rFonts w:asciiTheme="minorBidi" w:hAnsiTheme="minorBidi"/>
+          <w:sz w:val="24"/>
+          <w:szCs w:val="24"/>
+        </w:rPr>
+      </w:pPr>
+      <w:r>
+        <w:rPr>
+          <w:rFonts w:asciiTheme="minorBidi" w:hAnsiTheme="minorBidi"/>
+          <w:sz w:val="24"/>
+          <w:szCs w:val="24"/>
+        </w:rPr>
+        <w:t>Correo electrónico.</w:t>
+      </w:r>
+    </w:p>
+    <w:p>
+      <w:pPr>
+        <w:pStyle w:val="Prrafodelista"/>
+        <w:numPr>
+          <w:ilvl w:val="0"/>
+          <w:numId w:val="1"/>
+        </w:numPr>
+        <w:jc w:val="both"/>
+        <w:rPr>
+          <w:rFonts w:asciiTheme="minorBidi" w:hAnsiTheme="minorBidi"/>
+          <w:sz w:val="24"/>
+          <w:szCs w:val="24"/>
+        </w:rPr>
+      </w:pPr>
+      <w:r>
+        <w:rPr>
+          <w:rFonts w:asciiTheme="minorBidi" w:hAnsiTheme="minorBidi"/>
+          <w:sz w:val="24"/>
+          <w:szCs w:val="24"/>
+        </w:rPr>
+        <w:t>Teléfono.</w:t>
+      </w:r>
+    </w:p>
+    <w:p>
+      <w:pPr>
+        <w:pStyle w:val="Prrafodelista"/>
+        <w:numPr>
+          <w:ilvl w:val="0"/>
+          <w:numId w:val="1"/>
+        </w:numPr>
+        <w:jc w:val="both"/>
+        <w:rPr>
+          <w:rFonts w:asciiTheme="minorBidi" w:hAnsiTheme="minorBidi"/>
+          <w:sz w:val="24"/>
+          <w:szCs w:val="24"/>
+        </w:rPr>
+      </w:pPr>
+      <w:r>
+        <w:rPr>
+          <w:rFonts w:asciiTheme="minorBidi" w:hAnsiTheme="minorBidi"/>
+          <w:sz w:val="24"/>
+          <w:szCs w:val="24"/>
+        </w:rPr>
+        <w:t>Contraseña.</w:t>
+      </w:r>
+    </w:p>
+    <w:p>
+      <w:pPr>
+        <w:pStyle w:val="Prrafodelista"/>
+        <w:numPr>
+          <w:ilvl w:val="0"/>
+          <w:numId w:val="1"/>
+        </w:numPr>
+        <w:jc w:val="both"/>
+        <w:rPr>
+          <w:rFonts w:asciiTheme="minorBidi" w:hAnsiTheme="minorBidi"/>
+          <w:sz w:val="24"/>
+          <w:szCs w:val="24"/>
+        </w:rPr>
+      </w:pPr>
+      <w:r>
+        <w:rPr>
+          <w:rFonts w:asciiTheme="minorBidi" w:hAnsiTheme="minorBidi"/>
+          <w:sz w:val="24"/>
+          <w:szCs w:val="24"/>
+        </w:rPr>
+        <w:t>Confirmación de contraseña.</w:t>
+      </w:r>
+    </w:p>
+    <w:p>
+      <w:pPr>
+        <w:pStyle w:val="Prrafodelista"/>
+        <w:numPr>
+          <w:ilvl w:val="0"/>
+          <w:numId w:val="1"/>
+        </w:numPr>
+        <w:jc w:val="both"/>
+        <w:rPr>
+          <w:rFonts w:asciiTheme="minorBidi" w:hAnsiTheme="minorBidi"/>
+          <w:sz w:val="24"/>
+          <w:szCs w:val="24"/>
+        </w:rPr>
+      </w:pPr>
+      <w:r>
+        <w:rPr>
+          <w:rFonts w:asciiTheme="minorBidi" w:hAnsiTheme="minorBidi"/>
+          <w:sz w:val="24"/>
+          <w:szCs w:val="24"/>
+        </w:rPr>
+        <w:t>Formulario de inicio de sesión</w:t>
+      </w:r>
+    </w:p>
+    <w:p>
+      <w:pPr>
+        <w:jc w:val="both"/>
+        <w:rPr>
+          <w:rFonts w:asciiTheme="minorBidi" w:hAnsiTheme="minorBidi"/>
+          <w:sz w:val="24"/>
+          <w:szCs w:val="24"/>
+        </w:rPr>
+      </w:pPr>
+      <w:r>
+        <w:rPr>
+          <w:rFonts w:asciiTheme="minorBidi" w:hAnsiTheme="minorBidi"/>
+          <w:sz w:val="24"/>
+          <w:szCs w:val="24"/>
+        </w:rPr>
+        <w:t>Permite ingresar al sistema mediante:</w:t>
+      </w:r>
+    </w:p>
+    <w:p>
+      <w:pPr>
+        <w:pStyle w:val="Prrafodelista"/>
+        <w:numPr>
+          <w:ilvl w:val="0"/>
+          <w:numId w:val="2"/>
+        </w:numPr>
+        <w:jc w:val="both"/>
+        <w:rPr>
+          <w:rFonts w:asciiTheme="minorBidi" w:hAnsiTheme="minorBidi"/>
+          <w:sz w:val="24"/>
+          <w:szCs w:val="24"/>
+        </w:rPr>
+      </w:pPr>
+      <w:r>
+        <w:rPr>
+          <w:rFonts w:asciiTheme="minorBidi" w:hAnsiTheme="minorBidi"/>
+          <w:sz w:val="24"/>
+          <w:szCs w:val="24"/>
+        </w:rPr>
+        <w:t>Correo electrónico.</w:t>
+      </w:r>
+    </w:p>
+    <w:p>
+      <w:pPr>
+        <w:pStyle w:val="Prrafodelista"/>
+        <w:numPr>
+          <w:ilvl w:val="0"/>
+          <w:numId w:val="2"/>
+        </w:numPr>
+        <w:jc w:val="both"/>
+        <w:rPr>
+          <w:rFonts w:asciiTheme="minorBidi" w:hAnsiTheme="minorBidi"/>
+          <w:sz w:val="24"/>
+          <w:szCs w:val="24"/>
+        </w:rPr>
+      </w:pPr>
+      <w:r>
+        <w:rPr>
+          <w:rFonts w:asciiTheme="minorBidi" w:hAnsiTheme="minorBidi"/>
+          <w:sz w:val="24"/>
+          <w:szCs w:val="24"/>
+        </w:rPr>
+        <w:t>Contraseña.</w:t>
+      </w:r>
+    </w:p>
+    <w:p>
+      <w:pPr>
+        <w:pStyle w:val="Prrafodelista"/>
+        <w:numPr>
+          <w:ilvl w:val="0"/>
+          <w:numId w:val="2"/>
+        </w:numPr>
+        <w:jc w:val="both"/>
+        <w:rPr>
+          <w:rFonts w:asciiTheme="minorBidi" w:hAnsiTheme="minorBidi"/>
+          <w:sz w:val="24"/>
+          <w:szCs w:val="24"/>
+        </w:rPr>
+      </w:pPr>
+      <w:r>
+        <w:rPr>
+          <w:rFonts w:asciiTheme="minorBidi" w:hAnsiTheme="minorBidi"/>
+          <w:sz w:val="24"/>
+          <w:szCs w:val="24"/>
+        </w:rPr>
+        <w:t>Formulario de reserva</w:t>
+      </w:r>
+    </w:p>
+    <w:p>
+      <w:pPr>
+        <w:jc w:val="both"/>
+        <w:rPr>
+          <w:rFonts w:asciiTheme="minorBidi" w:hAnsiTheme="minorBidi"/>
+          <w:sz w:val="24"/>
+          <w:szCs w:val="24"/>
+        </w:rPr>
+      </w:pPr>
+      <w:r>
+        <w:rPr>
+          <w:rFonts w:asciiTheme="minorBidi" w:hAnsiTheme="minorBidi"/>
+          <w:sz w:val="24"/>
+          <w:szCs w:val="24"/>
+        </w:rPr>
+        <w:t>Permite seleccionar los datos necesarios para realizar una reserva:</w:t>
+      </w:r>
+    </w:p>
+    <w:p>
+      <w:pPr>
+        <w:pStyle w:val="Prrafodelista"/>
+        <w:numPr>
+          <w:ilvl w:val="0"/>
+          <w:numId w:val="3"/>
+        </w:numPr>
+        <w:jc w:val="both"/>
+        <w:rPr>
+          <w:rFonts w:asciiTheme="minorBidi" w:hAnsiTheme="minorBidi"/>
+          <w:sz w:val="24"/>
+          <w:szCs w:val="24"/>
+        </w:rPr>
+      </w:pPr>
+      <w:r>
+        <w:rPr>
+          <w:rFonts w:asciiTheme="minorBidi" w:hAnsiTheme="minorBidi"/>
+          <w:sz w:val="24"/>
+          <w:szCs w:val="24"/>
+        </w:rPr>
+        <w:t>Producto.</w:t>
+      </w:r>
+    </w:p>
+    <w:p>
+      <w:pPr>
+        <w:pStyle w:val="Prrafodelista"/>
+        <w:numPr>
+          <w:ilvl w:val="0"/>
+          <w:numId w:val="3"/>
+        </w:numPr>
+        <w:jc w:val="both"/>
+        <w:rPr>
+          <w:rFonts w:asciiTheme="minorBidi" w:hAnsiTheme="minorBidi"/>
+          <w:sz w:val="24"/>
+          <w:szCs w:val="24"/>
+        </w:rPr>
+      </w:pPr>
+      <w:r>
+        <w:rPr>
+          <w:rFonts w:asciiTheme="minorBidi" w:hAnsiTheme="minorBidi"/>
+          <w:sz w:val="24"/>
+          <w:szCs w:val="24"/>
+        </w:rPr>
+        <w:t>Talle.</w:t>
+      </w:r>
+    </w:p>
+    <w:p>
+      <w:pPr>
+        <w:pStyle w:val="Prrafodelista"/>
+        <w:numPr>
+          <w:ilvl w:val="0"/>
+          <w:numId w:val="3"/>
+        </w:numPr>
+        <w:jc w:val="both"/>
+        <w:rPr>
+          <w:rFonts w:asciiTheme="minorBidi" w:hAnsiTheme="minorBidi"/>
+          <w:sz w:val="24"/>
+          <w:szCs w:val="24"/>
+        </w:rPr>
+      </w:pPr>
+      <w:r>
+        <w:rPr>
+          <w:rFonts w:asciiTheme="minorBidi" w:hAnsiTheme="minorBidi"/>
+          <w:sz w:val="24"/>
+          <w:szCs w:val="24"/>
+        </w:rPr>
+        <w:t>Color.</w:t>
+      </w:r>
+    </w:p>
+    <w:p>
+      <w:pPr>
+        <w:pStyle w:val="Prrafodelista"/>
+        <w:numPr>
+          <w:ilvl w:val="0"/>
+          <w:numId w:val="3"/>
+        </w:numPr>
+        <w:jc w:val="both"/>
+        <w:rPr>
+          <w:rFonts w:asciiTheme="minorBidi" w:hAnsiTheme="minorBidi"/>
+          <w:sz w:val="24"/>
+          <w:szCs w:val="24"/>
+        </w:rPr>
+      </w:pPr>
+      <w:r>
+        <w:rPr>
+          <w:rFonts w:asciiTheme="minorBidi" w:hAnsiTheme="minorBidi"/>
+          <w:sz w:val="24"/>
+          <w:szCs w:val="24"/>
+        </w:rPr>
+        <w:lastRenderedPageBreak/>
+        <w:t>Fecha.</w:t>
+      </w:r>
+    </w:p>
+    <w:p>
+      <w:pPr>
+        <w:pStyle w:val="Prrafodelista"/>
+        <w:numPr>
+          <w:ilvl w:val="0"/>
+          <w:numId w:val="3"/>
+        </w:numPr>
+        <w:jc w:val="both"/>
+        <w:rPr>
+          <w:rFonts w:asciiTheme="minorBidi" w:hAnsiTheme="minorBidi"/>
+          <w:sz w:val="24"/>
+          <w:szCs w:val="24"/>
+        </w:rPr>
+      </w:pPr>
+      <w:r>
+        <w:rPr>
+          <w:rFonts w:asciiTheme="minorBidi" w:hAnsiTheme="minorBidi"/>
+          <w:sz w:val="24"/>
+          <w:szCs w:val="24"/>
+        </w:rPr>
+        <w:t>Horario.</w:t>
+      </w:r>
+    </w:p>
+    <w:p>
+      <w:pPr>
+        <w:jc w:val="both"/>
+        <w:rPr>
+          <w:rFonts w:asciiTheme="minorBidi" w:hAnsiTheme="minorBidi"/>
+          <w:sz w:val="24"/>
+          <w:szCs w:val="24"/>
+        </w:rPr>
+      </w:pPr>
+      <w:r>
+        <w:rPr>
+          <w:rFonts w:asciiTheme="minorBidi" w:hAnsiTheme="minorBidi"/>
+          <w:sz w:val="24"/>
+          <w:szCs w:val="24"/>
+        </w:rPr>
+        <w:t>Los horarios disponibles corresponden al horario de atención establecido para el local: 08:00 a 12:00 y 16:00 a 20:00.</w:t>
+      </w:r>
+    </w:p>
+    <w:p>
+      <w:pPr>
+        <w:jc w:val="both"/>
+        <w:rPr>
+          <w:rFonts w:asciiTheme="minorBidi" w:hAnsiTheme="minorBidi"/>
+          <w:sz w:val="24"/>
+          <w:szCs w:val="24"/>
+        </w:rPr>
+      </w:pPr>
+    </w:p>
+    <w:p>
+      <w:pPr>
+        <w:jc w:val="both"/>
+        <w:rPr>
+          <w:rFonts w:asciiTheme="minorBidi" w:hAnsiTheme="minorBidi"/>
+          <w:sz w:val="24"/>
+          <w:szCs w:val="24"/>
+        </w:rPr>
+      </w:pPr>
+    </w:p>
+    <w:p>
+      <w:pPr>
+        <w:jc w:val="both"/>
+        <w:rPr>
+          <w:rFonts w:asciiTheme="minorBidi" w:hAnsiTheme="minorBidi"/>
+          <w:sz w:val="24"/>
+          <w:szCs w:val="24"/>
+        </w:rPr>
+      </w:pPr>
+      <w:r>
+        <w:rPr>
+          <w:rFonts w:asciiTheme="minorBidi" w:hAnsiTheme="minorBidi"/>
+          <w:sz w:val="24"/>
+          <w:szCs w:val="24"/>
+        </w:rPr>
+        <w:t>3.</w:t>
+      </w:r>
+      <w:r>
+        <w:rPr>
+          <w:rFonts w:asciiTheme="minorBidi" w:hAnsiTheme="minorBidi"/>
+          <w:b/>
+          <w:bCs/>
+          <w:sz w:val="24"/>
+          <w:szCs w:val="24"/>
+        </w:rPr>
+        <w:t xml:space="preserve"> Navegación</w:t>
+      </w:r>
+    </w:p>
+    <w:p>
+      <w:pPr>
+        <w:jc w:val="both"/>
+        <w:rPr>
+          <w:rFonts w:asciiTheme="minorBidi" w:hAnsiTheme="minorBidi"/>
+          <w:sz w:val="24"/>
+          <w:szCs w:val="24"/>
+        </w:rPr>
+      </w:pPr>
+      <w:r>
+        <w:rPr>
+          <w:rFonts w:asciiTheme="minorBidi" w:hAnsiTheme="minorBidi"/>
+          <w:sz w:val="24"/>
+          <w:szCs w:val="24"/>
+        </w:rPr>
+        <w:t>Se implementó la navegación entre las diferentes pantallas siguiendo el flujo definido para el sistema.</w:t>
+      </w:r>
+    </w:p>
+    <w:p>
+      <w:pPr>
+        <w:jc w:val="both"/>
+        <w:rPr>
+          <w:rFonts w:asciiTheme="minorBidi" w:hAnsiTheme="minorBidi"/>
+          <w:sz w:val="24"/>
+          <w:szCs w:val="24"/>
+        </w:rPr>
+      </w:pPr>
+      <w:r>
+        <w:rPr>
+          <w:rFonts w:asciiTheme="minorBidi" w:hAnsiTheme="minorBidi"/>
+          <w:sz w:val="24"/>
+          <w:szCs w:val="24"/>
+        </w:rPr>
+        <w:t>El recorrido principal es:</w:t>
+      </w:r>
+    </w:p>
+    <w:p>
+      <w:pPr>
+        <w:jc w:val="both"/>
+        <w:rPr>
+          <w:rFonts w:asciiTheme="minorBidi" w:hAnsiTheme="minorBidi"/>
+          <w:sz w:val="24"/>
+          <w:szCs w:val="24"/>
+        </w:rPr>
+      </w:pPr>
+      <w:r>
+        <w:rPr>
+          <w:rFonts w:asciiTheme="minorBidi" w:hAnsiTheme="minorBidi"/>
+          <w:sz w:val="24"/>
+          <w:szCs w:val="24"/>
+        </w:rPr>
+        <w:t>Inicio → Productos → Detalle del producto → Inicio de sesión → Reserva → Confirmación → Mis reservas</w:t>
+      </w:r>
+    </w:p>
+    <w:p>
+      <w:pPr>
+        <w:jc w:val="both"/>
+        <w:rPr>
+          <w:rFonts w:asciiTheme="minorBidi" w:hAnsiTheme="minorBidi"/>
+          <w:sz w:val="24"/>
+          <w:szCs w:val="24"/>
+        </w:rPr>
+      </w:pPr>
+      <w:r>
+        <w:rPr>
+          <w:rFonts w:asciiTheme="minorBidi" w:hAnsiTheme="minorBidi"/>
+          <w:sz w:val="24"/>
+          <w:szCs w:val="24"/>
+        </w:rPr>
+        <w:t>En caso de que el usuario no tenga una cuenta:</w:t>
+      </w:r>
+    </w:p>
+    <w:p>
+      <w:pPr>
+        <w:jc w:val="both"/>
+        <w:rPr>
+          <w:rFonts w:asciiTheme="minorBidi" w:hAnsiTheme="minorBidi"/>
+          <w:sz w:val="24"/>
+          <w:szCs w:val="24"/>
+        </w:rPr>
+      </w:pPr>
+      <w:r>
+        <w:rPr>
+          <w:rFonts w:asciiTheme="minorBidi" w:hAnsiTheme="minorBidi"/>
+          <w:sz w:val="24"/>
+          <w:szCs w:val="24"/>
+        </w:rPr>
+        <w:t>Detalle del producto → Reserva → Registro → Inicio de sesión → Reserva → Confirmación</w:t>
+      </w:r>
+    </w:p>
+    <w:p>
+      <w:pPr>
+        <w:jc w:val="both"/>
+        <w:rPr>
+          <w:rFonts w:asciiTheme="minorBidi" w:hAnsiTheme="minorBidi"/>
+          <w:sz w:val="24"/>
+          <w:szCs w:val="24"/>
+        </w:rPr>
+      </w:pPr>
+      <w:r>
+        <w:rPr>
+          <w:rFonts w:asciiTheme="minorBidi" w:hAnsiTheme="minorBidi"/>
+          <w:sz w:val="24"/>
+          <w:szCs w:val="24"/>
+        </w:rPr>
+        <w:t>También se implementó un menú dinámico según el estado de sesión del usuario.</w:t>
+      </w:r>
+    </w:p>
+    <w:p>
+      <w:pPr>
+        <w:jc w:val="both"/>
+        <w:rPr>
+          <w:rFonts w:asciiTheme="minorBidi" w:hAnsiTheme="minorBidi"/>
+          <w:sz w:val="24"/>
+          <w:szCs w:val="24"/>
+        </w:rPr>
+      </w:pPr>
+      <w:r>
+        <w:rPr>
+          <w:rFonts w:asciiTheme="minorBidi" w:hAnsiTheme="minorBidi"/>
+          <w:sz w:val="24"/>
+          <w:szCs w:val="24"/>
+        </w:rPr>
+        <w:t>Cuando el usuario no inició sesión se muestran las opciones Iniciar sesión y Registrarse.</w:t>
+      </w:r>
+    </w:p>
+    <w:p>
+      <w:pPr>
+        <w:jc w:val="both"/>
+        <w:rPr>
+          <w:rFonts w:asciiTheme="minorBidi" w:hAnsiTheme="minorBidi"/>
+          <w:sz w:val="24"/>
+          <w:szCs w:val="24"/>
+        </w:rPr>
+      </w:pPr>
+      <w:r>
+        <w:rPr>
+          <w:rFonts w:asciiTheme="minorBidi" w:hAnsiTheme="minorBidi"/>
+          <w:sz w:val="24"/>
+          <w:szCs w:val="24"/>
+        </w:rPr>
+        <w:t>Cuando el usuario inicia sesión, estas opciones son reemplazadas por Mis reservas y Cerrar sesión.</w:t>
+      </w:r>
+    </w:p>
+    <w:p>
+      <w:pPr>
+        <w:jc w:val="both"/>
+        <w:rPr>
+          <w:rFonts w:asciiTheme="minorBidi" w:hAnsiTheme="minorBidi"/>
+          <w:sz w:val="24"/>
+          <w:szCs w:val="24"/>
+        </w:rPr>
+      </w:pPr>
+    </w:p>
+    <w:p>
+      <w:pPr>
+        <w:jc w:val="both"/>
+        <w:rPr>
+          <w:rFonts w:asciiTheme="minorBidi" w:hAnsiTheme="minorBidi"/>
+          <w:sz w:val="24"/>
+          <w:szCs w:val="24"/>
+        </w:rPr>
+      </w:pPr>
+    </w:p>
+    <w:p>
+      <w:pPr>
+        <w:jc w:val="both"/>
+        <w:rPr>
+          <w:rFonts w:asciiTheme="minorBidi" w:hAnsiTheme="minorBidi"/>
+          <w:sz w:val="24"/>
+          <w:szCs w:val="24"/>
+        </w:rPr>
+      </w:pPr>
+      <w:r>
+        <w:rPr>
+          <w:rFonts w:asciiTheme="minorBidi" w:hAnsiTheme="minorBidi"/>
+          <w:sz w:val="24"/>
+          <w:szCs w:val="24"/>
+        </w:rPr>
+        <w:t xml:space="preserve">4. </w:t>
+      </w:r>
+      <w:r>
+        <w:rPr>
+          <w:rFonts w:asciiTheme="minorBidi" w:hAnsiTheme="minorBidi"/>
+          <w:b/>
+          <w:bCs/>
+          <w:sz w:val="24"/>
+          <w:szCs w:val="24"/>
+        </w:rPr>
+        <w:t>Validaciones básicas</w:t>
+      </w:r>
+    </w:p>
+    <w:p>
+      <w:pPr>
+        <w:jc w:val="both"/>
+        <w:rPr>
+          <w:rFonts w:asciiTheme="minorBidi" w:hAnsiTheme="minorBidi"/>
+          <w:sz w:val="24"/>
+          <w:szCs w:val="24"/>
+        </w:rPr>
+      </w:pPr>
+      <w:r>
+        <w:rPr>
+          <w:rFonts w:asciiTheme="minorBidi" w:hAnsiTheme="minorBidi"/>
+          <w:sz w:val="24"/>
+          <w:szCs w:val="24"/>
+        </w:rPr>
+        <w:t>Se implementaron diferentes validaciones utilizando JavaScript.</w:t>
+      </w:r>
+    </w:p>
+    <w:p>
+      <w:pPr>
+        <w:jc w:val="both"/>
+        <w:rPr>
+          <w:rFonts w:asciiTheme="minorBidi" w:hAnsiTheme="minorBidi"/>
+          <w:sz w:val="24"/>
+          <w:szCs w:val="24"/>
+        </w:rPr>
+      </w:pPr>
+      <w:r>
+        <w:rPr>
+          <w:rFonts w:asciiTheme="minorBidi" w:hAnsiTheme="minorBidi"/>
+          <w:sz w:val="24"/>
+          <w:szCs w:val="24"/>
+        </w:rPr>
+        <w:t>En el formulario de registro se controla que todos los campos obligatorios estén completos y que las contraseñas coincidan.</w:t>
+      </w:r>
+    </w:p>
+    <w:p>
+      <w:pPr>
+        <w:jc w:val="both"/>
+        <w:rPr>
+          <w:rFonts w:asciiTheme="minorBidi" w:hAnsiTheme="minorBidi"/>
+          <w:sz w:val="24"/>
+          <w:szCs w:val="24"/>
+        </w:rPr>
+      </w:pPr>
+      <w:r>
+        <w:rPr>
+          <w:rFonts w:asciiTheme="minorBidi" w:hAnsiTheme="minorBidi"/>
+          <w:sz w:val="24"/>
+          <w:szCs w:val="24"/>
+        </w:rPr>
+        <w:t>En el formulario de inicio de sesión se verifica que el correo electrónico y la contraseña estén completos y que la contraseña tenga como mínimo seis caracteres.</w:t>
+      </w:r>
+    </w:p>
+    <w:p>
+      <w:pPr>
+        <w:jc w:val="both"/>
+        <w:rPr>
+          <w:rFonts w:asciiTheme="minorBidi" w:hAnsiTheme="minorBidi"/>
+          <w:sz w:val="24"/>
+          <w:szCs w:val="24"/>
+        </w:rPr>
+      </w:pPr>
+      <w:r>
+        <w:rPr>
+          <w:rFonts w:asciiTheme="minorBidi" w:hAnsiTheme="minorBidi"/>
+          <w:sz w:val="24"/>
+          <w:szCs w:val="24"/>
+        </w:rPr>
+        <w:t>En el formulario de reserva se controla que se hayan seleccionado el talle, color, fecha y horario.</w:t>
+      </w:r>
+    </w:p>
+    <w:p>
+      <w:pPr>
+        <w:jc w:val="both"/>
+        <w:rPr>
+          <w:rFonts w:asciiTheme="minorBidi" w:hAnsiTheme="minorBidi"/>
+          <w:sz w:val="24"/>
+          <w:szCs w:val="24"/>
+        </w:rPr>
+      </w:pPr>
+      <w:r>
+        <w:rPr>
+          <w:rFonts w:asciiTheme="minorBidi" w:hAnsiTheme="minorBidi"/>
+          <w:sz w:val="24"/>
+          <w:szCs w:val="24"/>
+        </w:rPr>
+        <w:t>También se implementó una validación de fechas que impide seleccionar días anteriores al actual.</w:t>
+      </w:r>
+    </w:p>
+    <w:p>
+      <w:pPr>
+        <w:jc w:val="both"/>
+        <w:rPr>
+          <w:rFonts w:asciiTheme="minorBidi" w:hAnsiTheme="minorBidi"/>
+          <w:sz w:val="24"/>
+          <w:szCs w:val="24"/>
+        </w:rPr>
+      </w:pPr>
+      <w:r>
+        <w:rPr>
+          <w:rFonts w:asciiTheme="minorBidi" w:hAnsiTheme="minorBidi"/>
+          <w:sz w:val="24"/>
+          <w:szCs w:val="24"/>
+        </w:rPr>
+        <w:lastRenderedPageBreak/>
+        <w:t>Cuando se selecciona la fecha actual, los horarios que ya pasaron quedan deshabilitados. Para fechas posteriores se mantienen disponibles los horarios correspondientes.</w:t>
+      </w:r>
+    </w:p>
+    <w:p>
+      <w:pPr>
+        <w:jc w:val="both"/>
+        <w:rPr>
+          <w:rFonts w:asciiTheme="minorBidi" w:hAnsiTheme="minorBidi"/>
+          <w:sz w:val="24"/>
+          <w:szCs w:val="24"/>
+        </w:rPr>
+      </w:pPr>
+      <w:r>
+        <w:rPr>
+          <w:rFonts w:asciiTheme="minorBidi" w:hAnsiTheme="minorBidi"/>
+          <w:sz w:val="24"/>
+          <w:szCs w:val="24"/>
+        </w:rPr>
+        <w:t xml:space="preserve">Las reservas tienen una duración de 24 horas y su información se almacena temporalmente mediante </w:t>
+      </w:r>
+      <w:proofErr w:type="spellStart"/>
+      <w:r>
+        <w:rPr>
+          <w:rFonts w:asciiTheme="minorBidi" w:hAnsiTheme="minorBidi"/>
+          <w:sz w:val="24"/>
+          <w:szCs w:val="24"/>
+        </w:rPr>
+        <w:t>localStorage</w:t>
+      </w:r>
+      <w:proofErr w:type="spellEnd"/>
+      <w:r>
+        <w:rPr>
+          <w:rFonts w:asciiTheme="minorBidi" w:hAnsiTheme="minorBidi"/>
+          <w:sz w:val="24"/>
+          <w:szCs w:val="24"/>
+        </w:rPr>
+        <w:t>.</w:t>
+      </w:r>
+    </w:p>
+    <w:p>
+      <w:pPr>
+        <w:jc w:val="both"/>
+        <w:rPr>
+          <w:rFonts w:asciiTheme="minorBidi" w:hAnsiTheme="minorBidi"/>
+          <w:sz w:val="24"/>
+          <w:szCs w:val="24"/>
+        </w:rPr>
+      </w:pPr>
+    </w:p>
+    <w:p>
+      <w:pPr>
+        <w:jc w:val="both"/>
+        <w:rPr>
+          <w:rFonts w:asciiTheme="minorBidi" w:hAnsiTheme="minorBidi"/>
+          <w:sz w:val="24"/>
+          <w:szCs w:val="24"/>
+        </w:rPr>
+      </w:pPr>
+    </w:p>
+    <w:p>
+      <w:pPr>
+        <w:jc w:val="both"/>
+        <w:rPr>
+          <w:rFonts w:asciiTheme="minorBidi" w:hAnsiTheme="minorBidi"/>
+          <w:b/>
+          <w:bCs/>
+          <w:sz w:val="24"/>
+          <w:szCs w:val="24"/>
+        </w:rPr>
+      </w:pPr>
+      <w:r>
+        <w:rPr>
+          <w:rFonts w:asciiTheme="minorBidi" w:hAnsiTheme="minorBidi"/>
+          <w:sz w:val="24"/>
+          <w:szCs w:val="24"/>
+        </w:rPr>
+        <w:t xml:space="preserve">5. </w:t>
+      </w:r>
+      <w:r>
+        <w:rPr>
+          <w:rFonts w:asciiTheme="minorBidi" w:hAnsiTheme="minorBidi"/>
+          <w:b/>
+          <w:bCs/>
+          <w:sz w:val="24"/>
+          <w:szCs w:val="24"/>
+        </w:rPr>
+        <w:t>Capturas de pantalla</w:t>
+      </w:r>
+    </w:p>
+    <w:p>
+      <w:pPr>
+        <w:jc w:val="both"/>
+        <w:rPr>
+          <w:rFonts w:asciiTheme="minorBidi" w:hAnsiTheme="minorBidi"/>
+          <w:sz w:val="24"/>
+          <w:szCs w:val="24"/>
+        </w:rPr>
+      </w:pPr>
+      <w:r>
+        <w:rPr>
+          <w:noProof/>
+        </w:rPr>
+        <w:drawing>
+          <wp:inline distT="0" distB="0" distL="0" distR="0" wp14:anchorId="3F649B17" wp14:editId="016BFC5F">
+            <wp:extent cx="5400040" cy="2898775"/>
+            <wp:effectExtent l="0" t="0" r="0" b="0"/>
+            <wp:docPr id="109963771" name="Imagen 5"/>
+            <wp:cNvGraphicFramePr>
+              <a:graphicFrameLocks xmlns:a="http://schemas.openxmlformats.org/drawingml/2006/main" noChangeAspect="1"/>
+            </wp:cNvGraphicFramePr>
+            <a:graphic xmlns:a="http://schemas.openxmlformats.org/drawingml/2006/main">
+              <a:graphicData uri="http://schemas.openxmlformats.org/drawingml/2006/picture">
+                <pic:pic xmlns:pic="http://schemas.openxmlformats.org/drawingml/2006/picture">
+                  <pic:nvPicPr>
+                    <pic:cNvPr id="0" name="Picture 5"/>
+                    <pic:cNvPicPr>
+                      <a:picLocks noChangeAspect="1" noChangeArrowheads="1"/>
+                    </pic:cNvPicPr>
+                  </pic:nvPicPr>
+                  <pic:blipFill>
+                    <a:blip r:embed="rId5" cstate="print">
+                      <a:extLst>
+                        <a:ext uri="{28A0092B-C50C-407E-A947-70E740481C1C}">
+                          <a14:useLocalDpi xmlns:a14="http://schemas.microsoft.com/office/drawing/2010/main" val="0"/>
+                        </a:ext>
+                      </a:extLst>
+                    </a:blip>
+                    <a:srcRect/>
+                    <a:stretch>
+                      <a:fillRect/>
+                    </a:stretch>
+                  </pic:blipFill>
+                  <pic:spPr bwMode="auto">
+                    <a:xfrm>
+                      <a:off x="0" y="0"/>
+                      <a:ext cx="5400040" cy="2898775"/>
+                    </a:xfrm>
+                    <a:prstGeom prst="rect">
+                      <a:avLst/>
+                    </a:prstGeom>
+                    <a:noFill/>
+                    <a:ln>
+                      <a:noFill/>
+                    </a:ln>
+                  </pic:spPr>
+                </pic:pic>
+              </a:graphicData>
+            </a:graphic>
+          </wp:inline>
+        </w:drawing>
+      </w:r>
+      <w:r>
+        <w:rPr>
+          <w:noProof/>
+        </w:rPr>
+        <w:drawing>
+          <wp:inline distT="0" distB="0" distL="0" distR="0" wp14:anchorId="119E8B2A" wp14:editId="743B6524">
+            <wp:extent cx="5400040" cy="2899410"/>
+            <wp:effectExtent l="0" t="0" r="0" b="0"/>
+            <wp:docPr id="1829572991" name="Imagen 4"/>
+            <wp:cNvGraphicFramePr>
+              <a:graphicFrameLocks xmlns:a="http://schemas.openxmlformats.org/drawingml/2006/main" noChangeAspect="1"/>
+            </wp:cNvGraphicFramePr>
+            <a:graphic xmlns:a="http://schemas.openxmlformats.org/drawingml/2006/main">
+              <a:graphicData uri="http://schemas.openxmlformats.org/drawingml/2006/picture">
+                <pic:pic xmlns:pic="http://schemas.openxmlformats.org/drawingml/2006/picture">
+                  <pic:nvPicPr>
+                    <pic:cNvPr id="0" name="Picture 4"/>
+                    <pic:cNvPicPr>
+                      <a:picLocks noChangeAspect="1" noChangeArrowheads="1"/>
+                    </pic:cNvPicPr>
+                  </pic:nvPicPr>
+                  <pic:blipFill>
+                    <a:blip r:embed="rId6" cstate="print">
+                      <a:extLst>
+                        <a:ext uri="{28A0092B-C50C-407E-A947-70E740481C1C}">
+                          <a14:useLocalDpi xmlns:a14="http://schemas.microsoft.com/office/drawing/2010/main" val="0"/>
+                        </a:ext>
+                      </a:extLst>
+                    </a:blip>
+                    <a:srcRect/>
+                    <a:stretch>
+                      <a:fillRect/>
+                    </a:stretch>
+                  </pic:blipFill>
+                  <pic:spPr bwMode="auto">
+                    <a:xfrm>
+                      <a:off x="0" y="0"/>
+                      <a:ext cx="5400040" cy="2899410"/>
+                    </a:xfrm>
+                    <a:prstGeom prst="rect">
+                      <a:avLst/>
+                    </a:prstGeom>
+                    <a:noFill/>
+                    <a:ln>
+                      <a:noFill/>
+                    </a:ln>
+                  </pic:spPr>
+                </pic:pic>
+              </a:graphicData>
+            </a:graphic>
+          </wp:inline>
+        </w:drawing>
+      </w:r>
+      <w:r>
+        <w:rPr>
+          <w:noProof/>
+        </w:rPr>
+        <w:lastRenderedPageBreak/>
+        <w:drawing>
+          <wp:inline distT="0" distB="0" distL="0" distR="0" wp14:anchorId="0A4D7A84" wp14:editId="15E102F6">
+            <wp:extent cx="5400040" cy="2934970"/>
+            <wp:effectExtent l="0" t="0" r="0" b="0"/>
+            <wp:docPr id="2144207759" name="Imagen 3"/>
+            <wp:cNvGraphicFramePr>
+              <a:graphicFrameLocks xmlns:a="http://schemas.openxmlformats.org/drawingml/2006/main" noChangeAspect="1"/>
+            </wp:cNvGraphicFramePr>
+            <a:graphic xmlns:a="http://schemas.openxmlformats.org/drawingml/2006/main">
+              <a:graphicData uri="http://schemas.openxmlformats.org/drawingml/2006/picture">
+                <pic:pic xmlns:pic="http://schemas.openxmlformats.org/drawingml/2006/picture">
+                  <pic:nvPicPr>
+                    <pic:cNvPr id="0" name="Picture 3"/>
+                    <pic:cNvPicPr>
+                      <a:picLocks noChangeAspect="1" noChangeArrowheads="1"/>
+                    </pic:cNvPicPr>
+                  </pic:nvPicPr>
+                  <pic:blipFill>
+                    <a:blip r:embed="rId7" cstate="print">
+                      <a:extLst>
+                        <a:ext uri="{28A0092B-C50C-407E-A947-70E740481C1C}">
+                          <a14:useLocalDpi xmlns:a14="http://schemas.microsoft.com/office/drawing/2010/main" val="0"/>
+                        </a:ext>
+                      </a:extLst>
+                    </a:blip>
+                    <a:srcRect/>
+                    <a:stretch>
+                      <a:fillRect/>
+                    </a:stretch>
+                  </pic:blipFill>
+                  <pic:spPr bwMode="auto">
+                    <a:xfrm>
+                      <a:off x="0" y="0"/>
+                      <a:ext cx="5400040" cy="2934970"/>
+                    </a:xfrm>
+                    <a:prstGeom prst="rect">
+                      <a:avLst/>
+                    </a:prstGeom>
+                    <a:noFill/>
+                    <a:ln>
+                      <a:noFill/>
+                    </a:ln>
+                  </pic:spPr>
+                </pic:pic>
+              </a:graphicData>
+            </a:graphic>
+          </wp:inline>
+        </w:drawing>
+      </w:r>
+      <w:r>
+        <w:rPr>
+          <w:noProof/>
+        </w:rPr>
+        <w:drawing>
+          <wp:inline distT="0" distB="0" distL="0" distR="0" wp14:anchorId="5961CC87" wp14:editId="41452D20">
+            <wp:extent cx="5400040" cy="2867660"/>
+            <wp:effectExtent l="0" t="0" r="0" b="8890"/>
+            <wp:docPr id="1796830869" name="Imagen 2"/>
+            <wp:cNvGraphicFramePr>
+              <a:graphicFrameLocks xmlns:a="http://schemas.openxmlformats.org/drawingml/2006/main" noChangeAspect="1"/>
+            </wp:cNvGraphicFramePr>
+            <a:graphic xmlns:a="http://schemas.openxmlformats.org/drawingml/2006/main">
+              <a:graphicData uri="http://schemas.openxmlformats.org/drawingml/2006/picture">
+                <pic:pic xmlns:pic="http://schemas.openxmlformats.org/drawingml/2006/picture">
+                  <pic:nvPicPr>
+                    <pic:cNvPr id="0" name="Picture 2"/>
+                    <pic:cNvPicPr>
+                      <a:picLocks noChangeAspect="1" noChangeArrowheads="1"/>
+                    </pic:cNvPicPr>
+                  </pic:nvPicPr>
+                  <pic:blipFill>
+                    <a:blip r:embed="rId8" cstate="print">
+                      <a:extLst>
+                        <a:ext uri="{28A0092B-C50C-407E-A947-70E740481C1C}">
+                          <a14:useLocalDpi xmlns:a14="http://schemas.microsoft.com/office/drawing/2010/main" val="0"/>
+                        </a:ext>
+                      </a:extLst>
+                    </a:blip>
+                    <a:srcRect/>
+                    <a:stretch>
+                      <a:fillRect/>
+                    </a:stretch>
+                  </pic:blipFill>
+                  <pic:spPr bwMode="auto">
+                    <a:xfrm>
+                      <a:off x="0" y="0"/>
+                      <a:ext cx="5400040" cy="2867660"/>
+                    </a:xfrm>
+                    <a:prstGeom prst="rect">
+                      <a:avLst/>
+                    </a:prstGeom>
+                    <a:noFill/>
+                    <a:ln>
+                      <a:noFill/>
+                    </a:ln>
+                  </pic:spPr>
+                </pic:pic>
+              </a:graphicData>
+            </a:graphic>
+          </wp:inline>
+        </w:drawing>
+      </w:r>
+      <w:r>
+        <w:rPr>
+          <w:noProof/>
+        </w:rPr>
+        <w:drawing>
+          <wp:inline distT="0" distB="0" distL="0" distR="0" wp14:anchorId="17F04830" wp14:editId="48A6C7A0">
+            <wp:extent cx="5400040" cy="2889885"/>
+            <wp:effectExtent l="0" t="0" r="0" b="5715"/>
+            <wp:docPr id="2011020010" name="Imagen 1"/>
+            <wp:cNvGraphicFramePr>
+              <a:graphicFrameLocks xmlns:a="http://schemas.openxmlformats.org/drawingml/2006/main" noChangeAspect="1"/>
+            </wp:cNvGraphicFramePr>
+            <a:graphic xmlns:a="http://schemas.openxmlformats.org/drawingml/2006/main">
+              <a:graphicData uri="http://schemas.openxmlformats.org/drawingml/2006/picture">
+                <pic:pic xmlns:pic="http://schemas.openxmlformats.org/drawingml/2006/picture">
+                  <pic:nvPicPr>
+                    <pic:cNvPr id="0" name="Picture 1"/>
+                    <pic:cNvPicPr>
+                      <a:picLocks noChangeAspect="1" noChangeArrowheads="1"/>
+                    </pic:cNvPicPr>
+                  </pic:nvPicPr>
+                  <pic:blipFill>
+                    <a:blip r:embed="rId9" cstate="print">
+                      <a:extLst>
+                        <a:ext uri="{28A0092B-C50C-407E-A947-70E740481C1C}">
+                          <a14:useLocalDpi xmlns:a14="http://schemas.microsoft.com/office/drawing/2010/main" val="0"/>
+                        </a:ext>
+                      </a:extLst>
+                    </a:blip>
+                    <a:srcRect/>
+                    <a:stretch>
+                      <a:fillRect/>
+                    </a:stretch>
+                  </pic:blipFill>
+                  <pic:spPr bwMode="auto">
+                    <a:xfrm>
+                      <a:off x="0" y="0"/>
+                      <a:ext cx="5400040" cy="2889885"/>
+                    </a:xfrm>
+                    <a:prstGeom prst="rect">
+                      <a:avLst/>
+                    </a:prstGeom>
+                    <a:noFill/>
+                    <a:ln>
+                      <a:noFill/>
+                    </a:ln>
+                  </pic:spPr>
+                </pic:pic>
+              </a:graphicData>
+            </a:graphic>
+          </wp:inline>
+        </w:drawing>
+      </w:r>
+    </w:p>
+    <w:p>
+      <w:pPr>
+        <w:jc w:val="both"/>
+        <w:rPr>
+          <w:rFonts w:asciiTheme="minorBidi" w:hAnsiTheme="minorBidi"/>
+          <w:sz w:val="24"/>
+          <w:szCs w:val="24"/>
+        </w:rPr>
+      </w:pPr>
+      <w:r>
+        <w:rPr>
+          <w:noProof/>
+        </w:rPr>
+        <w:lastRenderedPageBreak/>
+        <w:drawing>
+          <wp:inline distT="0" distB="0" distL="0" distR="0" wp14:anchorId="306C9C1D" wp14:editId="1E128C8D">
+            <wp:extent cx="5400040" cy="2873375"/>
+            <wp:effectExtent l="0" t="0" r="0" b="3175"/>
+            <wp:docPr id="1534144964" name="Imagen 8"/>
+            <wp:cNvGraphicFramePr>
+              <a:graphicFrameLocks xmlns:a="http://schemas.openxmlformats.org/drawingml/2006/main" noChangeAspect="1"/>
+            </wp:cNvGraphicFramePr>
+            <a:graphic xmlns:a="http://schemas.openxmlformats.org/drawingml/2006/main">
+              <a:graphicData uri="http://schemas.openxmlformats.org/drawingml/2006/picture">
+                <pic:pic xmlns:pic="http://schemas.openxmlformats.org/drawingml/2006/picture">
+                  <pic:nvPicPr>
+                    <pic:cNvPr id="0" name="Picture 13"/>
+                    <pic:cNvPicPr>
+                      <a:picLocks noChangeAspect="1" noChangeArrowheads="1"/>
+                    </pic:cNvPicPr>
+                  </pic:nvPicPr>
+                  <pic:blipFill>
+                    <a:blip r:embed="rId10" cstate="print">
+                      <a:extLst>
+                        <a:ext uri="{28A0092B-C50C-407E-A947-70E740481C1C}">
+                          <a14:useLocalDpi xmlns:a14="http://schemas.microsoft.com/office/drawing/2010/main" val="0"/>
+                        </a:ext>
+                      </a:extLst>
+                    </a:blip>
+                    <a:srcRect/>
+                    <a:stretch>
+                      <a:fillRect/>
+                    </a:stretch>
+                  </pic:blipFill>
+                  <pic:spPr bwMode="auto">
+                    <a:xfrm>
+                      <a:off x="0" y="0"/>
+                      <a:ext cx="5400040" cy="2873375"/>
+                    </a:xfrm>
+                    <a:prstGeom prst="rect">
+                      <a:avLst/>
+                    </a:prstGeom>
+                    <a:noFill/>
+                    <a:ln>
+                      <a:noFill/>
+                    </a:ln>
+                  </pic:spPr>
+                </pic:pic>
+              </a:graphicData>
+            </a:graphic>
+          </wp:inline>
+        </w:drawing>
+      </w:r>
+      <w:r>
+        <w:rPr>
+          <w:noProof/>
+        </w:rPr>
+        <w:drawing>
+          <wp:inline distT="0" distB="0" distL="0" distR="0" wp14:anchorId="51ADC74C" wp14:editId="77A8B41C">
+            <wp:extent cx="5400040" cy="2856230"/>
+            <wp:effectExtent l="0" t="0" r="0" b="1270"/>
+            <wp:docPr id="892770225" name="Imagen 7"/>
+            <wp:cNvGraphicFramePr>
+              <a:graphicFrameLocks xmlns:a="http://schemas.openxmlformats.org/drawingml/2006/main" noChangeAspect="1"/>
+            </wp:cNvGraphicFramePr>
+            <a:graphic xmlns:a="http://schemas.openxmlformats.org/drawingml/2006/main">
+              <a:graphicData uri="http://schemas.openxmlformats.org/drawingml/2006/picture">
+                <pic:pic xmlns:pic="http://schemas.openxmlformats.org/drawingml/2006/picture">
+                  <pic:nvPicPr>
+                    <pic:cNvPr id="0" name="Picture 12"/>
+                    <pic:cNvPicPr>
+                      <a:picLocks noChangeAspect="1" noChangeArrowheads="1"/>
+                    </pic:cNvPicPr>
+                  </pic:nvPicPr>
+                  <pic:blipFill>
+                    <a:blip r:embed="rId11" cstate="print">
+                      <a:extLst>
+                        <a:ext uri="{28A0092B-C50C-407E-A947-70E740481C1C}">
+                          <a14:useLocalDpi xmlns:a14="http://schemas.microsoft.com/office/drawing/2010/main" val="0"/>
+                        </a:ext>
+                      </a:extLst>
+                    </a:blip>
+                    <a:srcRect/>
+                    <a:stretch>
+                      <a:fillRect/>
+                    </a:stretch>
+                  </pic:blipFill>
+                  <pic:spPr bwMode="auto">
+                    <a:xfrm>
+                      <a:off x="0" y="0"/>
+                      <a:ext cx="5400040" cy="2856230"/>
+                    </a:xfrm>
+                    <a:prstGeom prst="rect">
+                      <a:avLst/>
+                    </a:prstGeom>
+                    <a:noFill/>
+                    <a:ln>
+                      <a:noFill/>
+                    </a:ln>
+                  </pic:spPr>
+                </pic:pic>
+              </a:graphicData>
+            </a:graphic>
+          </wp:inline>
+        </w:drawing>
+      </w:r>
+      <w:r>
+        <w:rPr>
+          <w:noProof/>
+        </w:rPr>
+        <w:drawing>
+          <wp:inline distT="0" distB="0" distL="0" distR="0" wp14:anchorId="12C38262" wp14:editId="0535AFDF">
+            <wp:extent cx="5400040" cy="2785745"/>
+            <wp:effectExtent l="0" t="0" r="0" b="0"/>
+            <wp:docPr id="2023928130" name="Imagen 6"/>
+            <wp:cNvGraphicFramePr>
+              <a:graphicFrameLocks xmlns:a="http://schemas.openxmlformats.org/drawingml/2006/main" noChangeAspect="1"/>
+            </wp:cNvGraphicFramePr>
+            <a:graphic xmlns:a="http://schemas.openxmlformats.org/drawingml/2006/main">
+              <a:graphicData uri="http://schemas.openxmlformats.org/drawingml/2006/picture">
+                <pic:pic xmlns:pic="http://schemas.openxmlformats.org/drawingml/2006/picture">
+                  <pic:nvPicPr>
+                    <pic:cNvPr id="0" name="Picture 11"/>
+                    <pic:cNvPicPr>
+                      <a:picLocks noChangeAspect="1" noChangeArrowheads="1"/>
+                    </pic:cNvPicPr>
+                  </pic:nvPicPr>
+                  <pic:blipFill>
+                    <a:blip r:embed="rId12" cstate="print">
+                      <a:extLst>
+                        <a:ext uri="{28A0092B-C50C-407E-A947-70E740481C1C}">
+                          <a14:useLocalDpi xmlns:a14="http://schemas.microsoft.com/office/drawing/2010/main" val="0"/>
+                        </a:ext>
+                      </a:extLst>
+                    </a:blip>
+                    <a:srcRect/>
+                    <a:stretch>
+                      <a:fillRect/>
+                    </a:stretch>
+                  </pic:blipFill>
+                  <pic:spPr bwMode="auto">
+                    <a:xfrm>
+                      <a:off x="0" y="0"/>
+                      <a:ext cx="5400040" cy="2785745"/>
+                    </a:xfrm>
+                    <a:prstGeom prst="rect">
+                      <a:avLst/>
+                    </a:prstGeom>
+                    <a:noFill/>
+                    <a:ln>
+                      <a:noFill/>
+                    </a:ln>
+                  </pic:spPr>
+                </pic:pic>
+              </a:graphicData>
+            </a:graphic>
+          </wp:inline>
+        </w:drawing>
+      </w:r>
+    </w:p>
+    <w:p>
+      <w:pPr>
+        <w:jc w:val="both"/>
+        <w:rPr>
+          <w:rFonts w:asciiTheme="minorBidi" w:hAnsiTheme="minorBidi"/>
+          <w:sz w:val="24"/>
+          <w:szCs w:val="24"/>
+        </w:rPr>
+      </w:pPr>
+    </w:p>
+    <w:p>
+      <w:pPr>
+        <w:jc w:val="both"/>
+        <w:rPr>
+          <w:rFonts w:asciiTheme="minorBidi" w:hAnsiTheme="minorBidi"/>
+          <w:sz w:val="24"/>
+          <w:szCs w:val="24"/>
+        </w:rPr>
+      </w:pPr>
+    </w:p>
+    <w:p>
+      <w:pPr>
+        <w:jc w:val="both"/>
+        <w:rPr>
+          <w:rFonts w:asciiTheme="minorBidi" w:hAnsiTheme="minorBidi"/>
+          <w:sz w:val="24"/>
+          <w:szCs w:val="24"/>
+        </w:rPr>
+      </w:pPr>
+      <w:r>
+        <w:rPr>
+          <w:rFonts w:asciiTheme="minorBidi" w:hAnsiTheme="minorBidi"/>
+          <w:sz w:val="24"/>
+          <w:szCs w:val="24"/>
+        </w:rPr>
+        <w:t xml:space="preserve">6. </w:t>
+      </w:r>
+      <w:r>
+        <w:rPr>
+          <w:rFonts w:asciiTheme="minorBidi" w:hAnsiTheme="minorBidi"/>
+          <w:b/>
+          <w:bCs/>
+          <w:sz w:val="24"/>
+          <w:szCs w:val="24"/>
+        </w:rPr>
+        <w:t>Código fuente o link de repositorio</w:t>
+      </w:r>
+    </w:p>
+    <w:p>
+      <w:pPr>
+        <w:jc w:val="both"/>
+        <w:rPr>
+          <w:rFonts w:asciiTheme="minorBidi" w:hAnsiTheme="minorBidi"/>
+          <w:sz w:val="24"/>
+          <w:szCs w:val="24"/>
+        </w:rPr>
+      </w:pPr>
+      <w:r>
+        <w:rPr>
+          <w:rFonts w:asciiTheme="minorBidi" w:hAnsiTheme="minorBidi"/>
+          <w:sz w:val="24"/>
+          <w:szCs w:val="24"/>
+        </w:rPr>
+        <w:t>El código fuente del proyecto fue organizado utilizando Git y subido a un repositorio de GitHub.</w:t>
+      </w:r>
+    </w:p>
+    <w:p>
+      <w:pPr>
+        <w:jc w:val="both"/>
+        <w:rPr>
+          <w:rFonts w:asciiTheme="minorBidi" w:hAnsiTheme="minorBidi"/>
+          <w:sz w:val="24"/>
+          <w:szCs w:val="24"/>
+        </w:rPr>
+      </w:pPr>
+      <w:r>
+        <w:rPr>
+          <w:rFonts w:asciiTheme="minorBidi" w:hAnsiTheme="minorBidi"/>
+          <w:sz w:val="24"/>
+          <w:szCs w:val="24"/>
+        </w:rPr>
+        <w:t>Repositorio:</w:t>
+      </w:r>
+    </w:p>
+    <w:p>
+      <w:pPr>
+        <w:jc w:val="both"/>
+        <w:rPr>
+          <w:rFonts w:asciiTheme="minorBidi" w:hAnsiTheme="minorBidi"/>
+          <w:sz w:val="24"/>
+          <w:szCs w:val="24"/>
+        </w:rPr>
+      </w:pPr>
+      <w:r>
+        <w:rPr>
+          <w:rFonts w:asciiTheme="minorBidi" w:hAnsiTheme="minorBidi"/>
+          <w:sz w:val="24"/>
+          <w:szCs w:val="24"/>
+        </w:rPr>
+        <w:t>https://github.com/AgustinVidal-04/MORENA-MODAS</w:t>
+      </w:r>
+    </w:p>
+    <w:p>
+      <w:pPr>
+        <w:jc w:val="both"/>
+        <w:rPr>
+          <w:rFonts w:asciiTheme="minorBidi" w:hAnsiTheme="minorBidi"/>
+          <w:sz w:val="24"/>
+          <w:szCs w:val="24"/>
+        </w:rPr>
+      </w:pPr>
+      <w:r>
+        <w:rPr>
+          <w:rFonts w:asciiTheme="minorBidi" w:hAnsiTheme="minorBidi"/>
+          <w:sz w:val="24"/>
+          <w:szCs w:val="24"/>
+        </w:rPr>
+        <w:t xml:space="preserve">El repositorio contiene el desarrollo realizado hasta el momento, incluyendo los archivos HTML, CSS y JavaScript utilizados para implementar el </w:t>
+      </w:r>
+      <w:proofErr w:type="spellStart"/>
+      <w:r>
+        <w:rPr>
+          <w:rFonts w:asciiTheme="minorBidi" w:hAnsiTheme="minorBidi"/>
+          <w:sz w:val="24"/>
+          <w:szCs w:val="24"/>
+        </w:rPr>
+        <w:t>front-end</w:t>
+      </w:r>
+      <w:proofErr w:type="spellEnd"/>
+      <w:r>
+        <w:rPr>
+          <w:rFonts w:asciiTheme="minorBidi" w:hAnsiTheme="minorBidi"/>
+          <w:sz w:val="24"/>
+          <w:szCs w:val="24"/>
+        </w:rPr>
+        <w:t>.</w:t>
+      </w:r>
+    </w:p>
+    <w:p>
+      <w:pPr>
+        <w:jc w:val="both"/>
+        <w:rPr>
+          <w:rFonts w:asciiTheme="minorBidi" w:hAnsiTheme="minorBidi"/>
+          <w:sz w:val="24"/>
+          <w:szCs w:val="24"/>
+        </w:rPr>
+      </w:pPr>
+    </w:p>
+    <w:p>
+      <w:pPr>
+        <w:jc w:val="both"/>
+        <w:rPr>
+          <w:rFonts w:asciiTheme="minorBidi" w:hAnsiTheme="minorBidi"/>
+          <w:sz w:val="24"/>
+          <w:szCs w:val="24"/>
+        </w:rPr>
+      </w:pPr>
+    </w:p>
+    <w:p>
+      <w:pPr>
+        <w:jc w:val="both"/>
+        <w:rPr>
+          <w:rFonts w:asciiTheme="minorBidi" w:hAnsiTheme="minorBidi"/>
+          <w:sz w:val="24"/>
+          <w:szCs w:val="24"/>
+        </w:rPr>
+      </w:pPr>
+      <w:r>
+        <w:rPr>
+          <w:rFonts w:asciiTheme="minorBidi" w:hAnsiTheme="minorBidi"/>
+          <w:sz w:val="24"/>
+          <w:szCs w:val="24"/>
+        </w:rPr>
+        <w:t xml:space="preserve">7. </w:t>
+      </w:r>
+      <w:r>
+        <w:rPr>
+          <w:rFonts w:asciiTheme="minorBidi" w:hAnsiTheme="minorBidi"/>
+          <w:b/>
+          <w:bCs/>
+          <w:sz w:val="24"/>
+          <w:szCs w:val="24"/>
+        </w:rPr>
+        <w:t>Link de conversación con GPT</w:t>
+      </w:r>
+    </w:p>
+    <w:p>
+      <w:pPr>
+        <w:jc w:val="both"/>
+        <w:rPr>
+          <w:rFonts w:asciiTheme="minorBidi" w:hAnsiTheme="minorBidi"/>
+          <w:sz w:val="24"/>
+          <w:szCs w:val="24"/>
+        </w:rPr>
+      </w:pPr>
+    </w:p>
+    <w:p>
+      <w:pPr>
+        <w:jc w:val="both"/>
+        <w:rPr>
+          <w:rFonts w:asciiTheme="minorBidi" w:hAnsiTheme="minorBidi"/>
+          <w:sz w:val="24"/>
+          <w:szCs w:val="24"/>
+        </w:rPr>
+      </w:pPr>
+      <w:r>
+        <w:rPr>
+          <w:rFonts w:asciiTheme="minorBidi" w:hAnsiTheme="minorBidi"/>
+          <w:sz w:val="24"/>
+          <w:szCs w:val="24"/>
+        </w:rPr>
+        <w:t xml:space="preserve">Durante el desarrollo del proyecto se utilizó </w:t>
+      </w:r>
+      <w:proofErr w:type="spellStart"/>
+      <w:r>
+        <w:rPr>
+          <w:rFonts w:asciiTheme="minorBidi" w:hAnsiTheme="minorBidi"/>
+          <w:sz w:val="24"/>
+          <w:szCs w:val="24"/>
+        </w:rPr>
+        <w:t>ChatGPT</w:t>
+      </w:r>
+      <w:proofErr w:type="spellEnd"/>
+      <w:r>
+        <w:rPr>
+          <w:rFonts w:asciiTheme="minorBidi" w:hAnsiTheme="minorBidi"/>
+          <w:sz w:val="24"/>
+          <w:szCs w:val="24"/>
+        </w:rPr>
+        <w:t xml:space="preserve"> como herramienta de apoyo para revisar la estructura, implementar funcionalidades, analizar errores y realizar pruebas del </w:t>
+      </w:r>
+      <w:proofErr w:type="spellStart"/>
+      <w:r>
+        <w:rPr>
+          <w:rFonts w:asciiTheme="minorBidi" w:hAnsiTheme="minorBidi"/>
+          <w:sz w:val="24"/>
+          <w:szCs w:val="24"/>
+        </w:rPr>
+        <w:t>front-end</w:t>
+      </w:r>
+      <w:proofErr w:type="spellEnd"/>
+      <w:r>
+        <w:rPr>
+          <w:rFonts w:asciiTheme="minorBidi" w:hAnsiTheme="minorBidi"/>
+          <w:sz w:val="24"/>
+          <w:szCs w:val="24"/>
+        </w:rPr>
+        <w:t>.</w:t>
+      </w:r>
+    </w:p>
+    <w:p>
+      <w:pPr>
+        <w:jc w:val="both"/>
+        <w:rPr>
+          <w:rFonts w:asciiTheme="minorBidi" w:hAnsiTheme="minorBidi"/>
+          <w:sz w:val="24"/>
+          <w:szCs w:val="24"/>
+        </w:rPr>
+      </w:pPr>
+      <w:r>
+        <w:rPr>
+          <w:rFonts w:asciiTheme="minorBidi" w:hAnsiTheme="minorBidi"/>
+          <w:sz w:val="24"/>
+          <w:szCs w:val="24"/>
+        </w:rPr>
+        <w:t>https://chatgpt.com/share/6a9f6496-c19c-83e9-8608-cd9d571e417d</w:t>
+      </w:r>
+    </w:p>
+    <w:p>
+      <w:pPr>
+        <w:jc w:val="both"/>
+        <w:rPr>
+          <w:rFonts w:asciiTheme="minorBidi" w:hAnsiTheme="minorBidi"/>
+          <w:sz w:val="24"/>
+          <w:szCs w:val="24"/>
+        </w:rPr>
+      </w:pPr>
+    </w:p>
+    <w:p>
+      <w:pPr>
+        <w:jc w:val="both"/>
+        <w:rPr>
+          <w:rFonts w:asciiTheme="minorBidi" w:hAnsiTheme="minorBidi"/>
+          <w:sz w:val="24"/>
+          <w:szCs w:val="24"/>
+        </w:rPr>
+      </w:pPr>
+    </w:p>
+    <w:p>
+      <w:pPr>
+        <w:jc w:val="both"/>
+        <w:rPr>
+          <w:rFonts w:asciiTheme="minorBidi" w:hAnsiTheme="minorBidi"/>
+          <w:sz w:val="24"/>
+          <w:szCs w:val="24"/>
+        </w:rPr>
+      </w:pPr>
+    </w:p>
+    <w:p>
+      <w:pPr>
+        <w:jc w:val="both"/>
+        <w:rPr>
+          <w:rFonts w:asciiTheme="minorBidi" w:hAnsiTheme="minorBidi"/>
+          <w:sz w:val="24"/>
+          <w:szCs w:val="24"/>
+        </w:rPr>
+      </w:pPr>
+      <w:r>
+        <w:rPr>
+          <w:rFonts w:asciiTheme="minorBidi" w:hAnsiTheme="minorBidi"/>
+          <w:sz w:val="24"/>
+          <w:szCs w:val="24"/>
+        </w:rPr>
+        <w:t xml:space="preserve">8. </w:t>
+      </w:r>
+      <w:r>
+        <w:rPr>
+          <w:rFonts w:asciiTheme="minorBidi" w:hAnsiTheme="minorBidi"/>
+          <w:b/>
+          <w:bCs/>
+          <w:sz w:val="24"/>
+          <w:szCs w:val="24"/>
+        </w:rPr>
+        <w:t>Bitácora actualizada</w:t>
+      </w:r>
+    </w:p>
+    <w:p>
+      <w:pPr>
+        <w:jc w:val="both"/>
+        <w:rPr>
+          <w:rFonts w:asciiTheme="minorBidi" w:hAnsiTheme="minorBidi"/>
+          <w:sz w:val="24"/>
+          <w:szCs w:val="24"/>
+        </w:rPr>
+      </w:pPr>
+      <w:r>
+        <w:rPr>
+          <w:rFonts w:asciiTheme="minorBidi" w:hAnsiTheme="minorBidi"/>
+          <w:sz w:val="24"/>
+          <w:szCs w:val="24"/>
+        </w:rPr>
+        <w:t xml:space="preserve">Durante la quinta semana del proyecto MORENA MODAS se comenzó con el desarrollo inicial del </w:t>
+      </w:r>
+      <w:proofErr w:type="spellStart"/>
+      <w:r>
+        <w:rPr>
+          <w:rFonts w:asciiTheme="minorBidi" w:hAnsiTheme="minorBidi"/>
+          <w:sz w:val="24"/>
+          <w:szCs w:val="24"/>
+        </w:rPr>
+        <w:t>front-end</w:t>
+      </w:r>
+      <w:proofErr w:type="spellEnd"/>
+      <w:r>
+        <w:rPr>
+          <w:rFonts w:asciiTheme="minorBidi" w:hAnsiTheme="minorBidi"/>
+          <w:sz w:val="24"/>
+          <w:szCs w:val="24"/>
+        </w:rPr>
+        <w:t>, tomando como base la arquitectura y las pantallas definidas durante la etapa anterior.</w:t>
+      </w:r>
+    </w:p>
+    <w:p>
+      <w:pPr>
+        <w:jc w:val="both"/>
+        <w:rPr>
+          <w:rFonts w:asciiTheme="minorBidi" w:hAnsiTheme="minorBidi"/>
+          <w:sz w:val="24"/>
+          <w:szCs w:val="24"/>
+        </w:rPr>
+      </w:pPr>
+      <w:r>
+        <w:rPr>
+          <w:rFonts w:asciiTheme="minorBidi" w:hAnsiTheme="minorBidi"/>
+          <w:sz w:val="24"/>
+          <w:szCs w:val="24"/>
+        </w:rPr>
+        <w:t>En primer lugar, se desarrolló la pantalla de inicio y posteriormente la pantalla de productos, incorporando diferentes prendas de ejemplo para poder realizar las pruebas del sistema. Luego se crearon las pantallas individuales de detalle para cada producto, incorporando la información correspondiente y el acceso al proceso de reserva.</w:t>
+      </w:r>
+    </w:p>
+    <w:p>
+      <w:pPr>
+        <w:jc w:val="both"/>
+        <w:rPr>
+          <w:rFonts w:asciiTheme="minorBidi" w:hAnsiTheme="minorBidi"/>
+          <w:sz w:val="24"/>
+          <w:szCs w:val="24"/>
+        </w:rPr>
+      </w:pPr>
+      <w:r>
+        <w:rPr>
+          <w:rFonts w:asciiTheme="minorBidi" w:hAnsiTheme="minorBidi"/>
+          <w:sz w:val="24"/>
+          <w:szCs w:val="24"/>
+        </w:rPr>
+        <w:t>Posteriormente, se desarrollaron los formularios de registro e inicio de sesión. En estos formularios se incorporaron validaciones para controlar los campos obligatorios, la coincidencia de las contraseñas y la longitud mínima de la contraseña.</w:t>
+      </w:r>
+    </w:p>
+    <w:p>
+      <w:pPr>
+        <w:jc w:val="both"/>
+        <w:rPr>
+          <w:rFonts w:asciiTheme="minorBidi" w:hAnsiTheme="minorBidi"/>
+          <w:sz w:val="24"/>
+          <w:szCs w:val="24"/>
+        </w:rPr>
+      </w:pPr>
+      <w:r>
+        <w:rPr>
+          <w:rFonts w:asciiTheme="minorBidi" w:hAnsiTheme="minorBidi"/>
+          <w:sz w:val="24"/>
+          <w:szCs w:val="24"/>
+        </w:rPr>
+        <w:t>Luego se desarrolló el formulario de reservas, incorporando la selección de producto, talle, color, fecha y horario. Se implementaron validaciones para impedir la selección de fechas anteriores al día actual y, cuando la reserva corresponde al día actual, se deshabilitaron los horarios que ya pasaron.</w:t>
+      </w:r>
+    </w:p>
+    <w:p>
+      <w:pPr>
+        <w:jc w:val="both"/>
+        <w:rPr>
+          <w:rFonts w:asciiTheme="minorBidi" w:hAnsiTheme="minorBidi"/>
+          <w:sz w:val="24"/>
+          <w:szCs w:val="24"/>
+        </w:rPr>
+      </w:pPr>
+      <w:r>
+        <w:rPr>
+          <w:rFonts w:asciiTheme="minorBidi" w:hAnsiTheme="minorBidi"/>
+          <w:sz w:val="24"/>
+          <w:szCs w:val="24"/>
+        </w:rPr>
+        <w:lastRenderedPageBreak/>
+        <w:t xml:space="preserve">También se desarrollaron las pantallas de confirmación y Mis reservas. Se implementó el almacenamiento temporal de la información de la reserva mediante </w:t>
+      </w:r>
+      <w:proofErr w:type="spellStart"/>
+      <w:r>
+        <w:rPr>
+          <w:rFonts w:asciiTheme="minorBidi" w:hAnsiTheme="minorBidi"/>
+          <w:sz w:val="24"/>
+          <w:szCs w:val="24"/>
+        </w:rPr>
+        <w:t>localStorage</w:t>
+      </w:r>
+      <w:proofErr w:type="spellEnd"/>
+      <w:r>
+        <w:rPr>
+          <w:rFonts w:asciiTheme="minorBidi" w:hAnsiTheme="minorBidi"/>
+          <w:sz w:val="24"/>
+          <w:szCs w:val="24"/>
+        </w:rPr>
+        <w:t>, permitiendo mostrar posteriormente los datos de la reserva y su duración de 24 horas.</w:t>
+      </w:r>
+    </w:p>
+    <w:p>
+      <w:pPr>
+        <w:jc w:val="both"/>
+        <w:rPr>
+          <w:rFonts w:asciiTheme="minorBidi" w:hAnsiTheme="minorBidi"/>
+          <w:sz w:val="24"/>
+          <w:szCs w:val="24"/>
+        </w:rPr>
+      </w:pPr>
+      <w:r>
+        <w:rPr>
+          <w:rFonts w:asciiTheme="minorBidi" w:hAnsiTheme="minorBidi"/>
+          <w:sz w:val="24"/>
+          <w:szCs w:val="24"/>
+        </w:rPr>
+        <w:t>Durante el desarrollo se realizaron diferentes pruebas para comprobar el funcionamiento de las pantallas, formularios, navegación y validaciones. Se verificó especialmente el recorrido completo desde la selección de un producto hasta la confirmación y consulta de la reserva.</w:t>
+      </w:r>
+    </w:p>
+    <w:p>
+      <w:pPr>
+        <w:jc w:val="both"/>
+        <w:rPr>
+          <w:rFonts w:asciiTheme="minorBidi" w:hAnsiTheme="minorBidi"/>
+          <w:sz w:val="24"/>
+          <w:szCs w:val="24"/>
+        </w:rPr>
+      </w:pPr>
+      <w:r>
+        <w:rPr>
+          <w:rFonts w:asciiTheme="minorBidi" w:hAnsiTheme="minorBidi"/>
+          <w:sz w:val="24"/>
+          <w:szCs w:val="24"/>
+        </w:rPr>
+        <w:t xml:space="preserve">Finalmente, se realizó una revisión general del </w:t>
+      </w:r>
+      <w:proofErr w:type="spellStart"/>
+      <w:r>
+        <w:rPr>
+          <w:rFonts w:asciiTheme="minorBidi" w:hAnsiTheme="minorBidi"/>
+          <w:sz w:val="24"/>
+          <w:szCs w:val="24"/>
+        </w:rPr>
+        <w:t>front-end</w:t>
+      </w:r>
+      <w:proofErr w:type="spellEnd"/>
+      <w:r>
+        <w:rPr>
+          <w:rFonts w:asciiTheme="minorBidi" w:hAnsiTheme="minorBidi"/>
+          <w:sz w:val="24"/>
+          <w:szCs w:val="24"/>
+        </w:rPr>
+        <w:t xml:space="preserve"> y se organizó el código fuente utilizando Git. El proyecto fue subido a un repositorio de GitHub para conservar y presentar el código desarrollado durante esta etapa.</w:t>
+      </w:r>
+    </w:p>
+    <w:p>
+      <w:pPr>
+        <w:jc w:val="both"/>
+        <w:rPr>
+          <w:rFonts w:asciiTheme="minorBidi" w:hAnsiTheme="minorBidi"/>
+          <w:sz w:val="24"/>
+          <w:szCs w:val="24"/>
+        </w:rPr>
+      </w:pPr>
+      <w:r>
+        <w:rPr>
+          <w:rFonts w:asciiTheme="minorBidi" w:hAnsiTheme="minorBidi"/>
+          <w:sz w:val="24"/>
+          <w:szCs w:val="24"/>
+        </w:rPr>
+        <w:t>Fecha: 07/09/2026</w:t>
+      </w:r>
+    </w:p>
+    <w:p>
+      <w:pPr>
+        <w:jc w:val="both"/>
+        <w:rPr>
+          <w:rFonts w:asciiTheme="minorBidi" w:hAnsiTheme="minorBidi"/>
+          <w:sz w:val="24"/>
+          <w:szCs w:val="24"/>
+        </w:rPr>
+      </w:pPr>
+      <w:r>
+        <w:rPr>
+          <w:rFonts w:asciiTheme="minorBidi" w:hAnsiTheme="minorBidi"/>
+          <w:sz w:val="24"/>
+          <w:szCs w:val="24"/>
+        </w:rPr>
+        <w:t>Semana: 5</w:t>
+      </w:r>
+    </w:p>
+    <w:p>
+      <w:pPr>
+        <w:jc w:val="both"/>
+        <w:rPr>
+          <w:rFonts w:asciiTheme="minorBidi" w:hAnsiTheme="minorBidi"/>
+          <w:sz w:val="24"/>
+          <w:szCs w:val="24"/>
+        </w:rPr>
+      </w:pPr>
+      <w:r>
+        <w:rPr>
+          <w:rFonts w:asciiTheme="minorBidi" w:hAnsiTheme="minorBidi"/>
+          <w:sz w:val="24"/>
+          <w:szCs w:val="24"/>
+        </w:rPr>
+        <w:t>Etapa: 5</w:t>
+      </w:r>
+    </w:p>
+    <w:p>
+      <w:pPr>
+        <w:jc w:val="both"/>
+        <w:rPr>
+          <w:rFonts w:asciiTheme="minorBidi" w:hAnsiTheme="minorBidi"/>
+          <w:sz w:val="24"/>
+          <w:szCs w:val="24"/>
+        </w:rPr>
+      </w:pPr>
+      <w:r>
+        <w:rPr>
+          <w:rFonts w:asciiTheme="minorBidi" w:hAnsiTheme="minorBidi"/>
+          <w:sz w:val="24"/>
+          <w:szCs w:val="24"/>
+        </w:rPr>
+        <w:t xml:space="preserve">Consulta: revisión de la entrega de desarrollo inicial del </w:t>
+      </w:r>
+      <w:proofErr w:type="spellStart"/>
+      <w:r>
+        <w:rPr>
+          <w:rFonts w:asciiTheme="minorBidi" w:hAnsiTheme="minorBidi"/>
+          <w:sz w:val="24"/>
+          <w:szCs w:val="24"/>
+        </w:rPr>
+        <w:t>front-end</w:t>
+      </w:r>
+      <w:proofErr w:type="spellEnd"/>
+      <w:r>
+        <w:rPr>
+          <w:rFonts w:asciiTheme="minorBidi" w:hAnsiTheme="minorBidi"/>
+          <w:sz w:val="24"/>
+          <w:szCs w:val="24"/>
+        </w:rPr>
+        <w:t>.</w:t>
+      </w:r>
+    </w:p>
+    <w:p>
+      <w:pPr>
+        <w:jc w:val="both"/>
+        <w:rPr>
+          <w:rFonts w:asciiTheme="minorBidi" w:hAnsiTheme="minorBidi"/>
+          <w:sz w:val="24"/>
+          <w:szCs w:val="24"/>
+        </w:rPr>
+      </w:pPr>
+      <w:r>
+        <w:rPr>
+          <w:rFonts w:asciiTheme="minorBidi" w:hAnsiTheme="minorBidi"/>
+          <w:sz w:val="24"/>
+          <w:szCs w:val="24"/>
+        </w:rPr>
+        <w:t xml:space="preserve">Sugerencia recibida: revisión de pantallas, formularios, navegación, validaciones, </w:t>
+      </w:r>
+      <w:proofErr w:type="spellStart"/>
+      <w:r>
+        <w:rPr>
+          <w:rFonts w:asciiTheme="minorBidi" w:hAnsiTheme="minorBidi"/>
+          <w:sz w:val="24"/>
+          <w:szCs w:val="24"/>
+        </w:rPr>
+        <w:t>localStorage</w:t>
+      </w:r>
+      <w:proofErr w:type="spellEnd"/>
+      <w:r>
+        <w:rPr>
+          <w:rFonts w:asciiTheme="minorBidi" w:hAnsiTheme="minorBidi"/>
+          <w:sz w:val="24"/>
+          <w:szCs w:val="24"/>
+        </w:rPr>
+        <w:t>, evidencias y preparación para la integración con back-</w:t>
+      </w:r>
+      <w:proofErr w:type="spellStart"/>
+      <w:r>
+        <w:rPr>
+          <w:rFonts w:asciiTheme="minorBidi" w:hAnsiTheme="minorBidi"/>
+          <w:sz w:val="24"/>
+          <w:szCs w:val="24"/>
+        </w:rPr>
+        <w:t>end</w:t>
+      </w:r>
+      <w:proofErr w:type="spellEnd"/>
+      <w:r>
+        <w:rPr>
+          <w:rFonts w:asciiTheme="minorBidi" w:hAnsiTheme="minorBidi"/>
+          <w:sz w:val="24"/>
+          <w:szCs w:val="24"/>
+        </w:rPr>
+        <w:t>.</w:t>
+      </w:r>
+    </w:p>
+    <w:p>
+      <w:pPr>
+        <w:jc w:val="both"/>
+        <w:rPr>
+          <w:rFonts w:asciiTheme="minorBidi" w:hAnsiTheme="minorBidi"/>
+          <w:sz w:val="24"/>
+          <w:szCs w:val="24"/>
+        </w:rPr>
+      </w:pPr>
+      <w:r>
+        <w:rPr>
+          <w:rFonts w:asciiTheme="minorBidi" w:hAnsiTheme="minorBidi"/>
+          <w:sz w:val="24"/>
+          <w:szCs w:val="24"/>
+        </w:rPr>
+        <w:t xml:space="preserve">Decisión tomada: </w:t>
+      </w:r>
+      <w:r>
+        <w:rPr>
+          <w:rFonts w:asciiTheme="minorBidi" w:hAnsiTheme="minorBidi"/>
+          <w:sz w:val="24"/>
+          <w:szCs w:val="24"/>
+        </w:rPr>
+        <w:t>No realice ningún cambio</w:t>
+      </w:r>
+    </w:p>
+    <w:p>
+      <w:pPr>
+        <w:jc w:val="both"/>
+        <w:rPr>
+          <w:rFonts w:asciiTheme="minorBidi" w:hAnsiTheme="minorBidi"/>
+          <w:sz w:val="24"/>
+          <w:szCs w:val="24"/>
+        </w:rPr>
+      </w:pPr>
+      <w:r>
+        <w:rPr>
+          <w:rFonts w:asciiTheme="minorBidi" w:hAnsiTheme="minorBidi"/>
+          <w:sz w:val="24"/>
+          <w:szCs w:val="24"/>
+        </w:rPr>
+        <w:t xml:space="preserve">Cambios aplicados/descartados: </w:t>
+      </w:r>
+      <w:r>
+        <w:rPr>
+          <w:rFonts w:asciiTheme="minorBidi" w:hAnsiTheme="minorBidi"/>
+          <w:sz w:val="24"/>
+          <w:szCs w:val="24"/>
+        </w:rPr>
+        <w:t xml:space="preserve">No aplique ningún </w:t>
+      </w:r>
+      <w:proofErr w:type="gramStart"/>
+      <w:r>
+        <w:rPr>
+          <w:rFonts w:asciiTheme="minorBidi" w:hAnsiTheme="minorBidi"/>
+          <w:sz w:val="24"/>
+          <w:szCs w:val="24"/>
+        </w:rPr>
+        <w:t>cambio</w:t>
+      </w:r>
+      <w:proofErr w:type="gramEnd"/>
+      <w:r>
+        <w:rPr>
+          <w:rFonts w:asciiTheme="minorBidi" w:hAnsiTheme="minorBidi"/>
+          <w:sz w:val="24"/>
+          <w:szCs w:val="24"/>
+        </w:rPr>
+        <w:t xml:space="preserve"> pero voy a tener en cuenta las consideraciones para </w:t>
+      </w:r>
+      <w:proofErr w:type="spellStart"/>
+      <w:r>
+        <w:rPr>
+          <w:rFonts w:asciiTheme="minorBidi" w:hAnsiTheme="minorBidi"/>
+          <w:sz w:val="24"/>
+          <w:szCs w:val="24"/>
+        </w:rPr>
+        <w:t>mas</w:t>
+      </w:r>
+      <w:proofErr w:type="spellEnd"/>
+      <w:r>
+        <w:rPr>
+          <w:rFonts w:asciiTheme="minorBidi" w:hAnsiTheme="minorBidi"/>
+          <w:sz w:val="24"/>
+          <w:szCs w:val="24"/>
+        </w:rPr>
+        <w:t xml:space="preserve"> adelante.</w:t>
+      </w:r>
+    </w:p>
+    <w:p>
+      <w:pPr>
+        <w:jc w:val="both"/>
+        <w:rPr>
+          <w:rFonts w:asciiTheme="minorBidi" w:hAnsiTheme="minorBidi"/>
+          <w:sz w:val="24"/>
+          <w:szCs w:val="24"/>
+        </w:rPr>
+      </w:pPr>
+      <w:r>
+        <w:rPr>
+          <w:rFonts w:asciiTheme="minorBidi" w:hAnsiTheme="minorBidi"/>
+          <w:sz w:val="24"/>
+          <w:szCs w:val="24"/>
+        </w:rPr>
+        <w:t xml:space="preserve">Justificación: </w:t>
+      </w:r>
+      <w:proofErr w:type="spellStart"/>
+      <w:r>
+        <w:rPr>
+          <w:rFonts w:asciiTheme="minorBidi" w:hAnsiTheme="minorBidi"/>
+          <w:sz w:val="24"/>
+          <w:szCs w:val="24"/>
+        </w:rPr>
+        <w:t>explicá</w:t>
+      </w:r>
+      <w:proofErr w:type="spellEnd"/>
+      <w:r>
+        <w:rPr>
+          <w:rFonts w:asciiTheme="minorBidi" w:hAnsiTheme="minorBidi"/>
+          <w:sz w:val="24"/>
+          <w:szCs w:val="24"/>
+        </w:rPr>
+        <w:t xml:space="preserve"> por qué aceptaste o descartaste cada sugerencia.</w:t>
+      </w:r>
+    </w:p>
+    <w:p>
+      <w:pPr>
+        <w:jc w:val="both"/>
+        <w:rPr>
+          <w:rFonts w:asciiTheme="minorBidi" w:hAnsiTheme="minorBidi"/>
+          <w:sz w:val="24"/>
+          <w:szCs w:val="24"/>
+          <w:lang w:val="en-US"/>
+        </w:rPr>
+      </w:pPr>
+      <w:r>
+        <w:rPr>
+          <w:rFonts w:asciiTheme="minorBidi" w:hAnsiTheme="minorBidi"/>
+          <w:sz w:val="24"/>
+          <w:szCs w:val="24"/>
+          <w:lang w:val="en-US"/>
+        </w:rPr>
+        <w:t>Link: https://chatgpt.com/share/6a9f6496-c19c-83e9-8608-cd9d571e417d</w:t>
+      </w:r>
     </w:p>
     <w:sectPr>
       <w:pgSz w:w="11906" w:h="16838"/>
@@ -398,6 +2739,359 @@
     </w:sectPr>
   </w:body>
 </w:document>
+</file>
+
+<file path=word/numbering.xml><?xml version="1.0" encoding="utf-8"?>
+<w:numbering xmlns:wpc="http://schemas.microsoft.com/office/word/2010/wordprocessingCanvas" xmlns:cx="http://schemas.microsoft.com/office/drawing/2014/chartex" xmlns:cx1="http://schemas.microsoft.com/office/drawing/2015/9/8/chartex" xmlns:cx2="http://schemas.microsoft.com/office/drawing/2015/10/21/chartex" xmlns:cx3="http://schemas.microsoft.com/office/drawing/2016/5/9/chartex" xmlns:cx4="http://schemas.microsoft.com/office/drawing/2016/5/10/chartex" xmlns:cx5="http://schemas.microsoft.com/office/drawing/2016/5/11/chartex" xmlns:cx6="http://schemas.microsoft.com/office/drawing/2016/5/12/chartex" xmlns:cx7="http://schemas.microsoft.com/office/drawing/2016/5/13/chartex" xmlns:cx8="http://schemas.microsoft.com/office/drawing/2016/5/14/chartex" xmlns:mc="http://schemas.openxmlformats.org/markup-compatibility/2006" xmlns:aink="http://schemas.microsoft.com/office/drawing/2016/ink" xmlns:am3d="http://schemas.microsoft.com/office/drawing/2017/model3d" xmlns:o="urn:schemas-microsoft-com:office:office" xmlns:oel="http://schemas.microsoft.com/office/2019/extlst" xmlns:r="http://schemas.openxmlformats.org/officeDocument/2006/relationships" xmlns:m="http://schemas.openxmlformats.org/officeDocument/2006/math" xmlns:v="urn:schemas-microsoft-com:vml" xmlns:wp14="http://schemas.microsoft.com/office/word/2010/wordprocessingDrawing" xmlns:wp="http://schemas.openxmlformats.org/drawingml/2006/wordprocessingDrawing" xmlns:w10="urn:schemas-microsoft-com:office:word" xmlns:w="http://schemas.openxmlformats.org/wordprocessingml/2006/main" xmlns:w14="http://schemas.microsoft.com/office/word/2010/wordml" xmlns:w15="http://schemas.microsoft.com/office/word/2012/wordml" xmlns:w16cex="http://schemas.microsoft.com/office/word/2018/wordml/cex" xmlns:w16cid="http://schemas.microsoft.com/office/word/2016/wordml/cid" xmlns:w16="http://schemas.microsoft.com/office/word/2018/wordml" xmlns:w16du="http://schemas.microsoft.com/office/word/2023/wordml/word16du" xmlns:w16sdtdh="http://schemas.microsoft.com/office/word/2020/wordml/sdtdatahash" xmlns:w16se="http://schemas.microsoft.com/office/word/2015/wordml/symex" xmlns:wpg="http://schemas.microsoft.com/office/word/2010/wordprocessingGroup" xmlns:wpi="http://schemas.microsoft.com/office/word/2010/wordprocessingInk" xmlns:wne="http://schemas.microsoft.com/office/word/2006/wordml" xmlns:wps="http://schemas.microsoft.com/office/word/2010/wordprocessingShape" mc:Ignorable="w14 w15 w16se w16cid w16 w16cex w16sdtdh w16du wp14">
+  <w:abstractNum w:abstractNumId="0" w15:restartNumberingAfterBreak="0">
+    <w:nsid w:val="36EA66AA"/>
+    <w:multiLevelType w:val="hybridMultilevel"/>
+    <w:tmpl w:val="B826FF02"/>
+    <w:lvl w:ilvl="0" w:tplc="2C0A0001">
+      <w:start w:val="1"/>
+      <w:numFmt w:val="bullet"/>
+      <w:lvlText w:val=""/>
+      <w:lvlJc w:val="left"/>
+      <w:pPr>
+        <w:ind w:left="720" w:hanging="360"/>
+      </w:pPr>
+      <w:rPr>
+        <w:rFonts w:ascii="Symbol" w:hAnsi="Symbol" w:hint="default"/>
+      </w:rPr>
+    </w:lvl>
+    <w:lvl w:ilvl="1" w:tplc="2C0A0003" w:tentative="1">
+      <w:start w:val="1"/>
+      <w:numFmt w:val="bullet"/>
+      <w:lvlText w:val="o"/>
+      <w:lvlJc w:val="left"/>
+      <w:pPr>
+        <w:ind w:left="1440" w:hanging="360"/>
+      </w:pPr>
+      <w:rPr>
+        <w:rFonts w:ascii="Courier New" w:hAnsi="Courier New" w:cs="Courier New" w:hint="default"/>
+      </w:rPr>
+    </w:lvl>
+    <w:lvl w:ilvl="2" w:tplc="2C0A0005" w:tentative="1">
+      <w:start w:val="1"/>
+      <w:numFmt w:val="bullet"/>
+      <w:lvlText w:val=""/>
+      <w:lvlJc w:val="left"/>
+      <w:pPr>
+        <w:ind w:left="2160" w:hanging="360"/>
+      </w:pPr>
+      <w:rPr>
+        <w:rFonts w:ascii="Wingdings" w:hAnsi="Wingdings" w:hint="default"/>
+      </w:rPr>
+    </w:lvl>
+    <w:lvl w:ilvl="3" w:tplc="2C0A0001" w:tentative="1">
+      <w:start w:val="1"/>
+      <w:numFmt w:val="bullet"/>
+      <w:lvlText w:val=""/>
+      <w:lvlJc w:val="left"/>
+      <w:pPr>
+        <w:ind w:left="2880" w:hanging="360"/>
+      </w:pPr>
+      <w:rPr>
+        <w:rFonts w:ascii="Symbol" w:hAnsi="Symbol" w:hint="default"/>
+      </w:rPr>
+    </w:lvl>
+    <w:lvl w:ilvl="4" w:tplc="2C0A0003" w:tentative="1">
+      <w:start w:val="1"/>
+      <w:numFmt w:val="bullet"/>
+      <w:lvlText w:val="o"/>
+      <w:lvlJc w:val="left"/>
+      <w:pPr>
+        <w:ind w:left="3600" w:hanging="360"/>
+      </w:pPr>
+      <w:rPr>
+        <w:rFonts w:ascii="Courier New" w:hAnsi="Courier New" w:cs="Courier New" w:hint="default"/>
+      </w:rPr>
+    </w:lvl>
+    <w:lvl w:ilvl="5" w:tplc="2C0A0005" w:tentative="1">
+      <w:start w:val="1"/>
+      <w:numFmt w:val="bullet"/>
+      <w:lvlText w:val=""/>
+      <w:lvlJc w:val="left"/>
+      <w:pPr>
+        <w:ind w:left="4320" w:hanging="360"/>
+      </w:pPr>
+      <w:rPr>
+        <w:rFonts w:ascii="Wingdings" w:hAnsi="Wingdings" w:hint="default"/>
+      </w:rPr>
+    </w:lvl>
+    <w:lvl w:ilvl="6" w:tplc="2C0A0001" w:tentative="1">
+      <w:start w:val="1"/>
+      <w:numFmt w:val="bullet"/>
+      <w:lvlText w:val=""/>
+      <w:lvlJc w:val="left"/>
+      <w:pPr>
+        <w:ind w:left="5040" w:hanging="360"/>
+      </w:pPr>
+      <w:rPr>
+        <w:rFonts w:ascii="Symbol" w:hAnsi="Symbol" w:hint="default"/>
+      </w:rPr>
+    </w:lvl>
+    <w:lvl w:ilvl="7" w:tplc="2C0A0003" w:tentative="1">
+      <w:start w:val="1"/>
+      <w:numFmt w:val="bullet"/>
+      <w:lvlText w:val="o"/>
+      <w:lvlJc w:val="left"/>
+      <w:pPr>
+        <w:ind w:left="5760" w:hanging="360"/>
+      </w:pPr>
+      <w:rPr>
+        <w:rFonts w:ascii="Courier New" w:hAnsi="Courier New" w:cs="Courier New" w:hint="default"/>
+      </w:rPr>
+    </w:lvl>
+    <w:lvl w:ilvl="8" w:tplc="2C0A0005" w:tentative="1">
+      <w:start w:val="1"/>
+      <w:numFmt w:val="bullet"/>
+      <w:lvlText w:val=""/>
+      <w:lvlJc w:val="left"/>
+      <w:pPr>
+        <w:ind w:left="6480" w:hanging="360"/>
+      </w:pPr>
+      <w:rPr>
+        <w:rFonts w:ascii="Wingdings" w:hAnsi="Wingdings" w:hint="default"/>
+      </w:rPr>
+    </w:lvl>
+  </w:abstractNum>
+  <w:abstractNum w:abstractNumId="1" w15:restartNumberingAfterBreak="0">
+    <w:nsid w:val="571930DD"/>
+    <w:multiLevelType w:val="hybridMultilevel"/>
+    <w:tmpl w:val="7C0C5A3A"/>
+    <w:lvl w:ilvl="0" w:tplc="2C0A0001">
+      <w:start w:val="1"/>
+      <w:numFmt w:val="bullet"/>
+      <w:lvlText w:val=""/>
+      <w:lvlJc w:val="left"/>
+      <w:pPr>
+        <w:ind w:left="720" w:hanging="360"/>
+      </w:pPr>
+      <w:rPr>
+        <w:rFonts w:ascii="Symbol" w:hAnsi="Symbol" w:hint="default"/>
+      </w:rPr>
+    </w:lvl>
+    <w:lvl w:ilvl="1" w:tplc="2C0A0003" w:tentative="1">
+      <w:start w:val="1"/>
+      <w:numFmt w:val="bullet"/>
+      <w:lvlText w:val="o"/>
+      <w:lvlJc w:val="left"/>
+      <w:pPr>
+        <w:ind w:left="1440" w:hanging="360"/>
+      </w:pPr>
+      <w:rPr>
+        <w:rFonts w:ascii="Courier New" w:hAnsi="Courier New" w:cs="Courier New" w:hint="default"/>
+      </w:rPr>
+    </w:lvl>
+    <w:lvl w:ilvl="2" w:tplc="2C0A0005" w:tentative="1">
+      <w:start w:val="1"/>
+      <w:numFmt w:val="bullet"/>
+      <w:lvlText w:val=""/>
+      <w:lvlJc w:val="left"/>
+      <w:pPr>
+        <w:ind w:left="2160" w:hanging="360"/>
+      </w:pPr>
+      <w:rPr>
+        <w:rFonts w:ascii="Wingdings" w:hAnsi="Wingdings" w:hint="default"/>
+      </w:rPr>
+    </w:lvl>
+    <w:lvl w:ilvl="3" w:tplc="2C0A0001" w:tentative="1">
+      <w:start w:val="1"/>
+      <w:numFmt w:val="bullet"/>
+      <w:lvlText w:val=""/>
+      <w:lvlJc w:val="left"/>
+      <w:pPr>
+        <w:ind w:left="2880" w:hanging="360"/>
+      </w:pPr>
+      <w:rPr>
+        <w:rFonts w:ascii="Symbol" w:hAnsi="Symbol" w:hint="default"/>
+      </w:rPr>
+    </w:lvl>
+    <w:lvl w:ilvl="4" w:tplc="2C0A0003" w:tentative="1">
+      <w:start w:val="1"/>
+      <w:numFmt w:val="bullet"/>
+      <w:lvlText w:val="o"/>
+      <w:lvlJc w:val="left"/>
+      <w:pPr>
+        <w:ind w:left="3600" w:hanging="360"/>
+      </w:pPr>
+      <w:rPr>
+        <w:rFonts w:ascii="Courier New" w:hAnsi="Courier New" w:cs="Courier New" w:hint="default"/>
+      </w:rPr>
+    </w:lvl>
+    <w:lvl w:ilvl="5" w:tplc="2C0A0005" w:tentative="1">
+      <w:start w:val="1"/>
+      <w:numFmt w:val="bullet"/>
+      <w:lvlText w:val=""/>
+      <w:lvlJc w:val="left"/>
+      <w:pPr>
+        <w:ind w:left="4320" w:hanging="360"/>
+      </w:pPr>
+      <w:rPr>
+        <w:rFonts w:ascii="Wingdings" w:hAnsi="Wingdings" w:hint="default"/>
+      </w:rPr>
+    </w:lvl>
+    <w:lvl w:ilvl="6" w:tplc="2C0A0001" w:tentative="1">
+      <w:start w:val="1"/>
+      <w:numFmt w:val="bullet"/>
+      <w:lvlText w:val=""/>
+      <w:lvlJc w:val="left"/>
+      <w:pPr>
+        <w:ind w:left="5040" w:hanging="360"/>
+      </w:pPr>
+      <w:rPr>
+        <w:rFonts w:ascii="Symbol" w:hAnsi="Symbol" w:hint="default"/>
+      </w:rPr>
+    </w:lvl>
+    <w:lvl w:ilvl="7" w:tplc="2C0A0003" w:tentative="1">
+      <w:start w:val="1"/>
+      <w:numFmt w:val="bullet"/>
+      <w:lvlText w:val="o"/>
+      <w:lvlJc w:val="left"/>
+      <w:pPr>
+        <w:ind w:left="5760" w:hanging="360"/>
+      </w:pPr>
+      <w:rPr>
+        <w:rFonts w:ascii="Courier New" w:hAnsi="Courier New" w:cs="Courier New" w:hint="default"/>
+      </w:rPr>
+    </w:lvl>
+    <w:lvl w:ilvl="8" w:tplc="2C0A0005" w:tentative="1">
+      <w:start w:val="1"/>
+      <w:numFmt w:val="bullet"/>
+      <w:lvlText w:val=""/>
+      <w:lvlJc w:val="left"/>
+      <w:pPr>
+        <w:ind w:left="6480" w:hanging="360"/>
+      </w:pPr>
+      <w:rPr>
+        <w:rFonts w:ascii="Wingdings" w:hAnsi="Wingdings" w:hint="default"/>
+      </w:rPr>
+    </w:lvl>
+  </w:abstractNum>
+  <w:abstractNum w:abstractNumId="2" w15:restartNumberingAfterBreak="0">
+    <w:nsid w:val="78855FD1"/>
+    <w:multiLevelType w:val="hybridMultilevel"/>
+    <w:tmpl w:val="52AE3D22"/>
+    <w:lvl w:ilvl="0" w:tplc="2C0A0001">
+      <w:start w:val="1"/>
+      <w:numFmt w:val="bullet"/>
+      <w:lvlText w:val=""/>
+      <w:lvlJc w:val="left"/>
+      <w:pPr>
+        <w:ind w:left="720" w:hanging="360"/>
+      </w:pPr>
+      <w:rPr>
+        <w:rFonts w:ascii="Symbol" w:hAnsi="Symbol" w:hint="default"/>
+      </w:rPr>
+    </w:lvl>
+    <w:lvl w:ilvl="1" w:tplc="2C0A0003" w:tentative="1">
+      <w:start w:val="1"/>
+      <w:numFmt w:val="bullet"/>
+      <w:lvlText w:val="o"/>
+      <w:lvlJc w:val="left"/>
+      <w:pPr>
+        <w:ind w:left="1440" w:hanging="360"/>
+      </w:pPr>
+      <w:rPr>
+        <w:rFonts w:ascii="Courier New" w:hAnsi="Courier New" w:cs="Courier New" w:hint="default"/>
+      </w:rPr>
+    </w:lvl>
+    <w:lvl w:ilvl="2" w:tplc="2C0A0005" w:tentative="1">
+      <w:start w:val="1"/>
+      <w:numFmt w:val="bullet"/>
+      <w:lvlText w:val=""/>
+      <w:lvlJc w:val="left"/>
+      <w:pPr>
+        <w:ind w:left="2160" w:hanging="360"/>
+      </w:pPr>
+      <w:rPr>
+        <w:rFonts w:ascii="Wingdings" w:hAnsi="Wingdings" w:hint="default"/>
+      </w:rPr>
+    </w:lvl>
+    <w:lvl w:ilvl="3" w:tplc="2C0A0001" w:tentative="1">
+      <w:start w:val="1"/>
+      <w:numFmt w:val="bullet"/>
+      <w:lvlText w:val=""/>
+      <w:lvlJc w:val="left"/>
+      <w:pPr>
+        <w:ind w:left="2880" w:hanging="360"/>
+      </w:pPr>
+      <w:rPr>
+        <w:rFonts w:ascii="Symbol" w:hAnsi="Symbol" w:hint="default"/>
+      </w:rPr>
+    </w:lvl>
+    <w:lvl w:ilvl="4" w:tplc="2C0A0003" w:tentative="1">
+      <w:start w:val="1"/>
+      <w:numFmt w:val="bullet"/>
+      <w:lvlText w:val="o"/>
+      <w:lvlJc w:val="left"/>
+      <w:pPr>
+        <w:ind w:left="3600" w:hanging="360"/>
+      </w:pPr>
+      <w:rPr>
+        <w:rFonts w:ascii="Courier New" w:hAnsi="Courier New" w:cs="Courier New" w:hint="default"/>
+      </w:rPr>
+    </w:lvl>
+    <w:lvl w:ilvl="5" w:tplc="2C0A0005" w:tentative="1">
+      <w:start w:val="1"/>
+      <w:numFmt w:val="bullet"/>
+      <w:lvlText w:val=""/>
+      <w:lvlJc w:val="left"/>
+      <w:pPr>
+        <w:ind w:left="4320" w:hanging="360"/>
+      </w:pPr>
+      <w:rPr>
+        <w:rFonts w:ascii="Wingdings" w:hAnsi="Wingdings" w:hint="default"/>
+      </w:rPr>
+    </w:lvl>
+    <w:lvl w:ilvl="6" w:tplc="2C0A0001" w:tentative="1">
+      <w:start w:val="1"/>
+      <w:numFmt w:val="bullet"/>
+      <w:lvlText w:val=""/>
+      <w:lvlJc w:val="left"/>
+      <w:pPr>
+        <w:ind w:left="5040" w:hanging="360"/>
+      </w:pPr>
+      <w:rPr>
+        <w:rFonts w:ascii="Symbol" w:hAnsi="Symbol" w:hint="default"/>
+      </w:rPr>
+    </w:lvl>
+    <w:lvl w:ilvl="7" w:tplc="2C0A0003" w:tentative="1">
+      <w:start w:val="1"/>
+      <w:numFmt w:val="bullet"/>
+      <w:lvlText w:val="o"/>
+      <w:lvlJc w:val="left"/>
+      <w:pPr>
+        <w:ind w:left="5760" w:hanging="360"/>
+      </w:pPr>
+      <w:rPr>
+        <w:rFonts w:ascii="Courier New" w:hAnsi="Courier New" w:cs="Courier New" w:hint="default"/>
+      </w:rPr>
+    </w:lvl>
+    <w:lvl w:ilvl="8" w:tplc="2C0A0005" w:tentative="1">
+      <w:start w:val="1"/>
+      <w:numFmt w:val="bullet"/>
+      <w:lvlText w:val=""/>
+      <w:lvlJc w:val="left"/>
+      <w:pPr>
+        <w:ind w:left="6480" w:hanging="360"/>
+      </w:pPr>
+      <w:rPr>
+        <w:rFonts w:ascii="Wingdings" w:hAnsi="Wingdings" w:hint="default"/>
+      </w:rPr>
+    </w:lvl>
+  </w:abstractNum>
+  <w:num w:numId="1" w16cid:durableId="643121320">
+    <w:abstractNumId w:val="0"/>
+  </w:num>
+  <w:num w:numId="2" w16cid:durableId="435058431">
+    <w:abstractNumId w:val="2"/>
+  </w:num>
+  <w:num w:numId="3" w16cid:durableId="730032427">
+    <w:abstractNumId w:val="1"/>
+  </w:num>
+</w:numbering>
 </file>
 
 <file path=word/styles.xml><?xml version="1.0" encoding="utf-8"?>
@@ -830,6 +3524,17 @@
     <w:semiHidden/>
     <w:unhideWhenUsed/>
   </w:style>
+  <w:style w:type="paragraph" w:styleId="Prrafodelista">
+    <w:name w:val="List Paragraph"/>
+    <w:basedOn w:val="Normal"/>
+    <w:uiPriority w:val="34"/>
+    <w:qFormat/>
+    <w:rsid w:val="00B3680C"/>
+    <w:pPr>
+      <w:ind w:left="720"/>
+      <w:contextualSpacing/>
+    </w:pPr>
+  </w:style>
 </w:styles>
 </file>
 

</xml_diff>